<commit_message>
Daily scoop log: $(date -u +'%Y-%m-%d')
</commit_message>
<xml_diff>
--- a/daily_logs/scoop_daily_log_2026-08-15.docx
+++ b/daily_logs/scoop_daily_log_2026-08-15.docx
@@ -26,7 +26,7 @@
         <w:rPr>
           <w:b/>
         </w:rPr>
-        <w:t>193 flagged (score &gt; 0)  ·  167 distinct stories (26 duplicate write-ups collapsed)  ·  57 shown after per-source cap</w:t>
+        <w:t>99 flagged (score &gt; 0)  ·  87 distinct stories (12 duplicate write-ups collapsed)  ·  50 shown after per-source cap</w:t>
       </w:r>
     </w:p>
     <w:p>
@@ -143,7 +143,7 @@
               <w:rPr>
                 <w:sz w:val="18"/>
               </w:rPr>
-              <w:t>13</w:t>
+              <w:t>8</w:t>
             </w:r>
           </w:p>
         </w:tc>
@@ -156,7 +156,7 @@
               <w:rPr>
                 <w:sz w:val="18"/>
               </w:rPr>
-              <w:t>21</w:t>
+              <w:t>11</w:t>
             </w:r>
           </w:p>
         </w:tc>
@@ -169,7 +169,7 @@
               <w:rPr>
                 <w:sz w:val="18"/>
               </w:rPr>
-              <w:t>22.8%</w:t>
+              <w:t>16.0%</w:t>
             </w:r>
           </w:p>
         </w:tc>
@@ -184,7 +184,7 @@
               <w:rPr>
                 <w:sz w:val="18"/>
               </w:rPr>
-              <w:t>ABC News</w:t>
+              <w:t>ABC Australia</w:t>
             </w:r>
           </w:p>
         </w:tc>
@@ -197,7 +197,7 @@
               <w:rPr>
                 <w:sz w:val="18"/>
               </w:rPr>
-              <w:t>5</w:t>
+              <w:t>8</w:t>
             </w:r>
           </w:p>
         </w:tc>
@@ -210,7 +210,7 @@
               <w:rPr>
                 <w:sz w:val="18"/>
               </w:rPr>
-              <w:t>9</w:t>
+              <w:t>11</w:t>
             </w:r>
           </w:p>
         </w:tc>
@@ -223,7 +223,7 @@
               <w:rPr>
                 <w:sz w:val="18"/>
               </w:rPr>
-              <w:t>8.8%</w:t>
+              <w:t>16.0%</w:t>
             </w:r>
           </w:p>
         </w:tc>
@@ -238,7 +238,7 @@
               <w:rPr>
                 <w:sz w:val="18"/>
               </w:rPr>
-              <w:t>CBS News</w:t>
+              <w:t>Fortune</w:t>
             </w:r>
           </w:p>
         </w:tc>
@@ -251,7 +251,7 @@
               <w:rPr>
                 <w:sz w:val="18"/>
               </w:rPr>
-              <w:t>4</w:t>
+              <w:t>6</w:t>
             </w:r>
           </w:p>
         </w:tc>
@@ -277,7 +277,7 @@
               <w:rPr>
                 <w:sz w:val="18"/>
               </w:rPr>
-              <w:t>7.0%</w:t>
+              <w:t>12.0%</w:t>
             </w:r>
           </w:p>
         </w:tc>
@@ -292,7 +292,7 @@
               <w:rPr>
                 <w:sz w:val="18"/>
               </w:rPr>
-              <w:t>Deadline</w:t>
+              <w:t>CBS News</w:t>
             </w:r>
           </w:p>
         </w:tc>
@@ -318,7 +318,7 @@
               <w:rPr>
                 <w:sz w:val="18"/>
               </w:rPr>
-              <w:t>15</w:t>
+              <w:t>6</w:t>
             </w:r>
           </w:p>
         </w:tc>
@@ -331,7 +331,7 @@
               <w:rPr>
                 <w:sz w:val="18"/>
               </w:rPr>
-              <w:t>7.0%</w:t>
+              <w:t>8.0%</w:t>
             </w:r>
           </w:p>
         </w:tc>
@@ -346,7 +346,7 @@
               <w:rPr>
                 <w:sz w:val="18"/>
               </w:rPr>
-              <w:t>NBC News</w:t>
+              <w:t>The Guardian US</w:t>
             </w:r>
           </w:p>
         </w:tc>
@@ -372,7 +372,7 @@
               <w:rPr>
                 <w:sz w:val="18"/>
               </w:rPr>
-              <w:t>11</w:t>
+              <w:t>9</w:t>
             </w:r>
           </w:p>
         </w:tc>
@@ -385,7 +385,7 @@
               <w:rPr>
                 <w:sz w:val="18"/>
               </w:rPr>
-              <w:t>5.3%</w:t>
+              <w:t>6.0%</w:t>
             </w:r>
           </w:p>
         </w:tc>
@@ -400,7 +400,7 @@
               <w:rPr>
                 <w:sz w:val="18"/>
               </w:rPr>
-              <w:t>ABC Australia</w:t>
+              <w:t>Deadline</w:t>
             </w:r>
           </w:p>
         </w:tc>
@@ -426,7 +426,7 @@
               <w:rPr>
                 <w:sz w:val="18"/>
               </w:rPr>
-              <w:t>13</w:t>
+              <w:t>6</w:t>
             </w:r>
           </w:p>
         </w:tc>
@@ -439,7 +439,7 @@
               <w:rPr>
                 <w:sz w:val="18"/>
               </w:rPr>
-              <w:t>5.3%</w:t>
+              <w:t>6.0%</w:t>
             </w:r>
           </w:p>
         </w:tc>
@@ -454,7 +454,7 @@
               <w:rPr>
                 <w:sz w:val="18"/>
               </w:rPr>
-              <w:t>Page Six</w:t>
+              <w:t>The Hill</w:t>
             </w:r>
           </w:p>
         </w:tc>
@@ -467,7 +467,7 @@
               <w:rPr>
                 <w:sz w:val="18"/>
               </w:rPr>
-              <w:t>3</w:t>
+              <w:t>2</w:t>
             </w:r>
           </w:p>
         </w:tc>
@@ -480,7 +480,7 @@
               <w:rPr>
                 <w:sz w:val="18"/>
               </w:rPr>
-              <w:t>3</w:t>
+              <w:t>4</w:t>
             </w:r>
           </w:p>
         </w:tc>
@@ -493,7 +493,7 @@
               <w:rPr>
                 <w:sz w:val="18"/>
               </w:rPr>
-              <w:t>5.3%</w:t>
+              <w:t>4.0%</w:t>
             </w:r>
           </w:p>
         </w:tc>
@@ -508,7 +508,7 @@
               <w:rPr>
                 <w:sz w:val="18"/>
               </w:rPr>
-              <w:t>South China Morning Post</w:t>
+              <w:t>NBC News</w:t>
             </w:r>
           </w:p>
         </w:tc>
@@ -534,7 +534,7 @@
               <w:rPr>
                 <w:sz w:val="18"/>
               </w:rPr>
-              <w:t>8</w:t>
+              <w:t>3</w:t>
             </w:r>
           </w:p>
         </w:tc>
@@ -547,7 +547,7 @@
               <w:rPr>
                 <w:sz w:val="18"/>
               </w:rPr>
-              <w:t>3.5%</w:t>
+              <w:t>4.0%</w:t>
             </w:r>
           </w:p>
         </w:tc>
@@ -562,7 +562,7 @@
               <w:rPr>
                 <w:sz w:val="18"/>
               </w:rPr>
-              <w:t>The Guardian US</w:t>
+              <w:t>BBC News</w:t>
             </w:r>
           </w:p>
         </w:tc>
@@ -588,7 +588,7 @@
               <w:rPr>
                 <w:sz w:val="18"/>
               </w:rPr>
-              <w:t>6</w:t>
+              <w:t>4</w:t>
             </w:r>
           </w:p>
         </w:tc>
@@ -601,7 +601,7 @@
               <w:rPr>
                 <w:sz w:val="18"/>
               </w:rPr>
-              <w:t>3.5%</w:t>
+              <w:t>4.0%</w:t>
             </w:r>
           </w:p>
         </w:tc>
@@ -616,7 +616,7 @@
               <w:rPr>
                 <w:sz w:val="18"/>
               </w:rPr>
-              <w:t>Axios</w:t>
+              <w:t>ABC News</w:t>
             </w:r>
           </w:p>
         </w:tc>
@@ -642,7 +642,7 @@
               <w:rPr>
                 <w:sz w:val="18"/>
               </w:rPr>
-              <w:t>4</w:t>
+              <w:t>5</w:t>
             </w:r>
           </w:p>
         </w:tc>
@@ -655,7 +655,7 @@
               <w:rPr>
                 <w:sz w:val="18"/>
               </w:rPr>
-              <w:t>3.5%</w:t>
+              <w:t>4.0%</w:t>
             </w:r>
           </w:p>
         </w:tc>
@@ -670,7 +670,7 @@
               <w:rPr>
                 <w:sz w:val="18"/>
               </w:rPr>
-              <w:t>Bloomberg</w:t>
+              <w:t>Los Angeles Times</w:t>
             </w:r>
           </w:p>
         </w:tc>
@@ -696,7 +696,7 @@
               <w:rPr>
                 <w:sz w:val="18"/>
               </w:rPr>
-              <w:t>3</w:t>
+              <w:t>4</w:t>
             </w:r>
           </w:p>
         </w:tc>
@@ -709,7 +709,7 @@
               <w:rPr>
                 <w:sz w:val="18"/>
               </w:rPr>
-              <w:t>3.5%</w:t>
+              <w:t>4.0%</w:t>
             </w:r>
           </w:p>
         </w:tc>
@@ -724,7 +724,7 @@
               <w:rPr>
                 <w:sz w:val="18"/>
               </w:rPr>
-              <w:t>Business Insider</w:t>
+              <w:t>The Information</w:t>
             </w:r>
           </w:p>
         </w:tc>
@@ -750,7 +750,7 @@
               <w:rPr>
                 <w:sz w:val="18"/>
               </w:rPr>
-              <w:t>8</w:t>
+              <w:t>2</w:t>
             </w:r>
           </w:p>
         </w:tc>
@@ -763,7 +763,7 @@
               <w:rPr>
                 <w:sz w:val="18"/>
               </w:rPr>
-              <w:t>1.8%</w:t>
+              <w:t>2.0%</w:t>
             </w:r>
           </w:p>
         </w:tc>
@@ -778,7 +778,7 @@
               <w:rPr>
                 <w:sz w:val="18"/>
               </w:rPr>
-              <w:t>Nature News</w:t>
+              <w:t>Business Insider</w:t>
             </w:r>
           </w:p>
         </w:tc>
@@ -804,7 +804,7 @@
               <w:rPr>
                 <w:sz w:val="18"/>
               </w:rPr>
-              <w:t>3</w:t>
+              <w:t>2</w:t>
             </w:r>
           </w:p>
         </w:tc>
@@ -817,7 +817,7 @@
               <w:rPr>
                 <w:sz w:val="18"/>
               </w:rPr>
-              <w:t>1.8%</w:t>
+              <w:t>2.0%</w:t>
             </w:r>
           </w:p>
         </w:tc>
@@ -832,7 +832,7 @@
               <w:rPr>
                 <w:sz w:val="18"/>
               </w:rPr>
-              <w:t>CNBC</w:t>
+              <w:t>South China Morning Post</w:t>
             </w:r>
           </w:p>
         </w:tc>
@@ -858,7 +858,7 @@
               <w:rPr>
                 <w:sz w:val="18"/>
               </w:rPr>
-              <w:t>10</w:t>
+              <w:t>2</w:t>
             </w:r>
           </w:p>
         </w:tc>
@@ -871,7 +871,7 @@
               <w:rPr>
                 <w:sz w:val="18"/>
               </w:rPr>
-              <w:t>1.8%</w:t>
+              <w:t>2.0%</w:t>
             </w:r>
           </w:p>
         </w:tc>
@@ -886,7 +886,7 @@
               <w:rPr>
                 <w:sz w:val="18"/>
               </w:rPr>
-              <w:t>The Information</w:t>
+              <w:t>Semafor</w:t>
             </w:r>
           </w:p>
         </w:tc>
@@ -912,7 +912,7 @@
               <w:rPr>
                 <w:sz w:val="18"/>
               </w:rPr>
-              <w:t>3</w:t>
+              <w:t>1</w:t>
             </w:r>
           </w:p>
         </w:tc>
@@ -925,7 +925,7 @@
               <w:rPr>
                 <w:sz w:val="18"/>
               </w:rPr>
-              <w:t>1.8%</w:t>
+              <w:t>2.0%</w:t>
             </w:r>
           </w:p>
         </w:tc>
@@ -940,7 +940,7 @@
               <w:rPr>
                 <w:sz w:val="18"/>
               </w:rPr>
-              <w:t>Wired</w:t>
+              <w:t>CNBC</w:t>
             </w:r>
           </w:p>
         </w:tc>
@@ -966,7 +966,7 @@
               <w:rPr>
                 <w:sz w:val="18"/>
               </w:rPr>
-              <w:t>2</w:t>
+              <w:t>1</w:t>
             </w:r>
           </w:p>
         </w:tc>
@@ -979,7 +979,7 @@
               <w:rPr>
                 <w:sz w:val="18"/>
               </w:rPr>
-              <w:t>1.8%</w:t>
+              <w:t>2.0%</w:t>
             </w:r>
           </w:p>
         </w:tc>
@@ -994,7 +994,7 @@
               <w:rPr>
                 <w:sz w:val="18"/>
               </w:rPr>
-              <w:t>Sueddeutsche Zeitung</w:t>
+              <w:t>Variety</w:t>
             </w:r>
           </w:p>
         </w:tc>
@@ -1020,7 +1020,7 @@
               <w:rPr>
                 <w:sz w:val="18"/>
               </w:rPr>
-              <w:t>1</w:t>
+              <w:t>3</w:t>
             </w:r>
           </w:p>
         </w:tc>
@@ -1033,7 +1033,7 @@
               <w:rPr>
                 <w:sz w:val="18"/>
               </w:rPr>
-              <w:t>1.8%</w:t>
+              <w:t>2.0%</w:t>
             </w:r>
           </w:p>
         </w:tc>
@@ -1048,7 +1048,7 @@
               <w:rPr>
                 <w:sz w:val="18"/>
               </w:rPr>
-              <w:t>BBC News</w:t>
+              <w:t>CBC News</w:t>
             </w:r>
           </w:p>
         </w:tc>
@@ -1074,7 +1074,7 @@
               <w:rPr>
                 <w:sz w:val="18"/>
               </w:rPr>
-              <w:t>17</w:t>
+              <w:t>1</w:t>
             </w:r>
           </w:p>
         </w:tc>
@@ -1087,7 +1087,7 @@
               <w:rPr>
                 <w:sz w:val="18"/>
               </w:rPr>
-              <w:t>1.8%</w:t>
+              <w:t>2.0%</w:t>
             </w:r>
           </w:p>
         </w:tc>
@@ -1102,7 +1102,7 @@
               <w:rPr>
                 <w:sz w:val="18"/>
               </w:rPr>
-              <w:t>Los Angeles Times</w:t>
+              <w:t>Inside Climate News</w:t>
             </w:r>
           </w:p>
         </w:tc>
@@ -1128,7 +1128,7 @@
               <w:rPr>
                 <w:sz w:val="18"/>
               </w:rPr>
-              <w:t>6</w:t>
+              <w:t>1</w:t>
             </w:r>
           </w:p>
         </w:tc>
@@ -1141,7 +1141,7 @@
               <w:rPr>
                 <w:sz w:val="18"/>
               </w:rPr>
-              <w:t>1.8%</w:t>
+              <w:t>2.0%</w:t>
             </w:r>
           </w:p>
         </w:tc>
@@ -1156,7 +1156,7 @@
               <w:rPr>
                 <w:sz w:val="18"/>
               </w:rPr>
-              <w:t>Al Jazeera English</w:t>
+              <w:t>Page Six</w:t>
             </w:r>
           </w:p>
         </w:tc>
@@ -1169,7 +1169,7 @@
               <w:rPr>
                 <w:sz w:val="18"/>
               </w:rPr>
-              <w:t>1</w:t>
+              <w:t>0</w:t>
             </w:r>
           </w:p>
         </w:tc>
@@ -1182,7 +1182,7 @@
               <w:rPr>
                 <w:sz w:val="18"/>
               </w:rPr>
-              <w:t>2</w:t>
+              <w:t>4</w:t>
             </w:r>
           </w:p>
         </w:tc>
@@ -1195,7 +1195,7 @@
               <w:rPr>
                 <w:sz w:val="18"/>
               </w:rPr>
-              <w:t>1.8%</w:t>
+              <w:t>0.0%</w:t>
             </w:r>
           </w:p>
         </w:tc>
@@ -1210,7 +1210,7 @@
               <w:rPr>
                 <w:sz w:val="18"/>
               </w:rPr>
-              <w:t>The Hill</w:t>
+              <w:t>Al Jazeera English</w:t>
             </w:r>
           </w:p>
         </w:tc>
@@ -1223,7 +1223,7 @@
               <w:rPr>
                 <w:sz w:val="18"/>
               </w:rPr>
-              <w:t>1</w:t>
+              <w:t>0</w:t>
             </w:r>
           </w:p>
         </w:tc>
@@ -1236,7 +1236,7 @@
               <w:rPr>
                 <w:sz w:val="18"/>
               </w:rPr>
-              <w:t>5</w:t>
+              <w:t>3</w:t>
             </w:r>
           </w:p>
         </w:tc>
@@ -1249,7 +1249,7 @@
               <w:rPr>
                 <w:sz w:val="18"/>
               </w:rPr>
-              <w:t>1.8%</w:t>
+              <w:t>0.0%</w:t>
             </w:r>
           </w:p>
         </w:tc>
@@ -1264,7 +1264,7 @@
               <w:rPr>
                 <w:sz w:val="18"/>
               </w:rPr>
-              <w:t>CBC News</w:t>
+              <w:t>Vox</w:t>
             </w:r>
           </w:p>
         </w:tc>
@@ -1277,33 +1277,33 @@
               <w:rPr>
                 <w:sz w:val="18"/>
               </w:rPr>
+              <w:t>0</w:t>
+            </w:r>
+          </w:p>
+        </w:tc>
+        <w:tc>
+          <w:tcPr>
+            <w:tcW w:type="dxa" w:w="2304"/>
+          </w:tcPr>
+          <w:p>
+            <w:r>
+              <w:rPr>
+                <w:sz w:val="18"/>
+              </w:rPr>
               <w:t>1</w:t>
             </w:r>
           </w:p>
         </w:tc>
         <w:tc>
           <w:tcPr>
-            <w:tcW w:type="dxa" w:w="2304"/>
+            <w:tcW w:type="dxa" w:w="1728"/>
           </w:tcPr>
           <w:p>
             <w:r>
               <w:rPr>
                 <w:sz w:val="18"/>
               </w:rPr>
-              <w:t>2</w:t>
-            </w:r>
-          </w:p>
-        </w:tc>
-        <w:tc>
-          <w:tcPr>
-            <w:tcW w:type="dxa" w:w="1728"/>
-          </w:tcPr>
-          <w:p>
-            <w:r>
-              <w:rPr>
-                <w:sz w:val="18"/>
-              </w:rPr>
-              <w:t>1.8%</w:t>
+              <w:t>0.0%</w:t>
             </w:r>
           </w:p>
         </w:tc>
@@ -1318,7 +1318,7 @@
               <w:rPr>
                 <w:sz w:val="18"/>
               </w:rPr>
-              <w:t>Texas Tribune</w:t>
+              <w:t>Axios</w:t>
             </w:r>
           </w:p>
         </w:tc>
@@ -1331,33 +1331,33 @@
               <w:rPr>
                 <w:sz w:val="18"/>
               </w:rPr>
+              <w:t>0</w:t>
+            </w:r>
+          </w:p>
+        </w:tc>
+        <w:tc>
+          <w:tcPr>
+            <w:tcW w:type="dxa" w:w="2304"/>
+          </w:tcPr>
+          <w:p>
+            <w:r>
+              <w:rPr>
+                <w:sz w:val="18"/>
+              </w:rPr>
               <w:t>1</w:t>
             </w:r>
           </w:p>
         </w:tc>
         <w:tc>
           <w:tcPr>
-            <w:tcW w:type="dxa" w:w="2304"/>
+            <w:tcW w:type="dxa" w:w="1728"/>
           </w:tcPr>
           <w:p>
             <w:r>
               <w:rPr>
                 <w:sz w:val="18"/>
               </w:rPr>
-              <w:t>2</w:t>
-            </w:r>
-          </w:p>
-        </w:tc>
-        <w:tc>
-          <w:tcPr>
-            <w:tcW w:type="dxa" w:w="1728"/>
-          </w:tcPr>
-          <w:p>
-            <w:r>
-              <w:rPr>
-                <w:sz w:val="18"/>
-              </w:rPr>
-              <w:t>1.8%</w:t>
+              <w:t>0.0%</w:t>
             </w:r>
           </w:p>
         </w:tc>
@@ -1372,7 +1372,7 @@
               <w:rPr>
                 <w:sz w:val="18"/>
               </w:rPr>
-              <w:t>TechCrunch</w:t>
+              <w:t>STAT</w:t>
             </w:r>
           </w:p>
         </w:tc>
@@ -1385,33 +1385,33 @@
               <w:rPr>
                 <w:sz w:val="18"/>
               </w:rPr>
+              <w:t>0</w:t>
+            </w:r>
+          </w:p>
+        </w:tc>
+        <w:tc>
+          <w:tcPr>
+            <w:tcW w:type="dxa" w:w="2304"/>
+          </w:tcPr>
+          <w:p>
+            <w:r>
+              <w:rPr>
+                <w:sz w:val="18"/>
+              </w:rPr>
               <w:t>1</w:t>
             </w:r>
           </w:p>
         </w:tc>
         <w:tc>
           <w:tcPr>
-            <w:tcW w:type="dxa" w:w="2304"/>
+            <w:tcW w:type="dxa" w:w="1728"/>
           </w:tcPr>
           <w:p>
             <w:r>
               <w:rPr>
                 <w:sz w:val="18"/>
               </w:rPr>
-              <w:t>1</w:t>
-            </w:r>
-          </w:p>
-        </w:tc>
-        <w:tc>
-          <w:tcPr>
-            <w:tcW w:type="dxa" w:w="1728"/>
-          </w:tcPr>
-          <w:p>
-            <w:r>
-              <w:rPr>
-                <w:sz w:val="18"/>
-              </w:rPr>
-              <w:t>1.8%</w:t>
+              <w:t>0.0%</w:t>
             </w:r>
           </w:p>
         </w:tc>
@@ -1426,7 +1426,7 @@
               <w:rPr>
                 <w:sz w:val="18"/>
               </w:rPr>
-              <w:t>Variety</w:t>
+              <w:t>Wired</w:t>
             </w:r>
           </w:p>
         </w:tc>
@@ -1439,33 +1439,33 @@
               <w:rPr>
                 <w:sz w:val="18"/>
               </w:rPr>
+              <w:t>0</w:t>
+            </w:r>
+          </w:p>
+        </w:tc>
+        <w:tc>
+          <w:tcPr>
+            <w:tcW w:type="dxa" w:w="2304"/>
+          </w:tcPr>
+          <w:p>
+            <w:r>
+              <w:rPr>
+                <w:sz w:val="18"/>
+              </w:rPr>
               <w:t>1</w:t>
             </w:r>
           </w:p>
         </w:tc>
         <w:tc>
           <w:tcPr>
-            <w:tcW w:type="dxa" w:w="2304"/>
+            <w:tcW w:type="dxa" w:w="1728"/>
           </w:tcPr>
           <w:p>
             <w:r>
               <w:rPr>
                 <w:sz w:val="18"/>
               </w:rPr>
-              <w:t>5</w:t>
-            </w:r>
-          </w:p>
-        </w:tc>
-        <w:tc>
-          <w:tcPr>
-            <w:tcW w:type="dxa" w:w="1728"/>
-          </w:tcPr>
-          <w:p>
-            <w:r>
-              <w:rPr>
-                <w:sz w:val="18"/>
-              </w:rPr>
-              <w:t>1.8%</w:t>
+              <w:t>0.0%</w:t>
             </w:r>
           </w:p>
         </w:tc>
@@ -1480,7 +1480,7 @@
               <w:rPr>
                 <w:sz w:val="18"/>
               </w:rPr>
-              <w:t>ProPublica</w:t>
+              <w:t>The Verge</w:t>
             </w:r>
           </w:p>
         </w:tc>
@@ -1506,7 +1506,7 @@
               <w:rPr>
                 <w:sz w:val="18"/>
               </w:rPr>
-              <w:t>2</w:t>
+              <w:t>1</w:t>
             </w:r>
           </w:p>
         </w:tc>
@@ -1534,7 +1534,7 @@
               <w:rPr>
                 <w:sz w:val="18"/>
               </w:rPr>
-              <w:t>The Verge</w:t>
+              <w:t>Financial Times</w:t>
             </w:r>
           </w:p>
         </w:tc>
@@ -1560,7 +1560,7 @@
               <w:rPr>
                 <w:sz w:val="18"/>
               </w:rPr>
-              <w:t>2</w:t>
+              <w:t>1</w:t>
             </w:r>
           </w:p>
         </w:tc>
@@ -1588,7 +1588,7 @@
               <w:rPr>
                 <w:sz w:val="18"/>
               </w:rPr>
-              <w:t>Semafor</w:t>
+              <w:t>The War Zone</w:t>
             </w:r>
           </w:p>
         </w:tc>
@@ -1614,493 +1614,7 @@
               <w:rPr>
                 <w:sz w:val="18"/>
               </w:rPr>
-              <w:t>1</w:t>
-            </w:r>
-          </w:p>
-        </w:tc>
-        <w:tc>
-          <w:tcPr>
-            <w:tcW w:type="dxa" w:w="1728"/>
-          </w:tcPr>
-          <w:p>
-            <w:r>
-              <w:rPr>
-                <w:sz w:val="18"/>
-              </w:rPr>
-              <w:t>0.0%</w:t>
-            </w:r>
-          </w:p>
-        </w:tc>
-      </w:tr>
-      <w:tr>
-        <w:tc>
-          <w:tcPr>
-            <w:tcW w:type="dxa" w:w="4320"/>
-          </w:tcPr>
-          <w:p>
-            <w:r>
-              <w:rPr>
-                <w:sz w:val="18"/>
-              </w:rPr>
-              <w:t>SCOTUSblog</w:t>
-            </w:r>
-          </w:p>
-        </w:tc>
-        <w:tc>
-          <w:tcPr>
-            <w:tcW w:type="dxa" w:w="1728"/>
-          </w:tcPr>
-          <w:p>
-            <w:r>
-              <w:rPr>
-                <w:sz w:val="18"/>
-              </w:rPr>
-              <w:t>0</w:t>
-            </w:r>
-          </w:p>
-        </w:tc>
-        <w:tc>
-          <w:tcPr>
-            <w:tcW w:type="dxa" w:w="2304"/>
-          </w:tcPr>
-          <w:p>
-            <w:r>
-              <w:rPr>
-                <w:sz w:val="18"/>
-              </w:rPr>
-              <w:t>1</w:t>
-            </w:r>
-          </w:p>
-        </w:tc>
-        <w:tc>
-          <w:tcPr>
-            <w:tcW w:type="dxa" w:w="1728"/>
-          </w:tcPr>
-          <w:p>
-            <w:r>
-              <w:rPr>
-                <w:sz w:val="18"/>
-              </w:rPr>
-              <w:t>0.0%</w:t>
-            </w:r>
-          </w:p>
-        </w:tc>
-      </w:tr>
-      <w:tr>
-        <w:tc>
-          <w:tcPr>
-            <w:tcW w:type="dxa" w:w="4320"/>
-          </w:tcPr>
-          <w:p>
-            <w:r>
-              <w:rPr>
-                <w:sz w:val="18"/>
-              </w:rPr>
-              <w:t>STAT</w:t>
-            </w:r>
-          </w:p>
-        </w:tc>
-        <w:tc>
-          <w:tcPr>
-            <w:tcW w:type="dxa" w:w="1728"/>
-          </w:tcPr>
-          <w:p>
-            <w:r>
-              <w:rPr>
-                <w:sz w:val="18"/>
-              </w:rPr>
-              <w:t>0</w:t>
-            </w:r>
-          </w:p>
-        </w:tc>
-        <w:tc>
-          <w:tcPr>
-            <w:tcW w:type="dxa" w:w="2304"/>
-          </w:tcPr>
-          <w:p>
-            <w:r>
-              <w:rPr>
-                <w:sz w:val="18"/>
-              </w:rPr>
-              <w:t>3</w:t>
-            </w:r>
-          </w:p>
-        </w:tc>
-        <w:tc>
-          <w:tcPr>
-            <w:tcW w:type="dxa" w:w="1728"/>
-          </w:tcPr>
-          <w:p>
-            <w:r>
-              <w:rPr>
-                <w:sz w:val="18"/>
-              </w:rPr>
-              <w:t>0.0%</w:t>
-            </w:r>
-          </w:p>
-        </w:tc>
-      </w:tr>
-      <w:tr>
-        <w:tc>
-          <w:tcPr>
-            <w:tcW w:type="dxa" w:w="4320"/>
-          </w:tcPr>
-          <w:p>
-            <w:r>
-              <w:rPr>
-                <w:sz w:val="18"/>
-              </w:rPr>
-              <w:t>Fortune</w:t>
-            </w:r>
-          </w:p>
-        </w:tc>
-        <w:tc>
-          <w:tcPr>
-            <w:tcW w:type="dxa" w:w="1728"/>
-          </w:tcPr>
-          <w:p>
-            <w:r>
-              <w:rPr>
-                <w:sz w:val="18"/>
-              </w:rPr>
-              <w:t>0</w:t>
-            </w:r>
-          </w:p>
-        </w:tc>
-        <w:tc>
-          <w:tcPr>
-            <w:tcW w:type="dxa" w:w="2304"/>
-          </w:tcPr>
-          <w:p>
-            <w:r>
-              <w:rPr>
-                <w:sz w:val="18"/>
-              </w:rPr>
-              <w:t>1</w:t>
-            </w:r>
-          </w:p>
-        </w:tc>
-        <w:tc>
-          <w:tcPr>
-            <w:tcW w:type="dxa" w:w="1728"/>
-          </w:tcPr>
-          <w:p>
-            <w:r>
-              <w:rPr>
-                <w:sz w:val="18"/>
-              </w:rPr>
-              <w:t>0.0%</w:t>
-            </w:r>
-          </w:p>
-        </w:tc>
-      </w:tr>
-      <w:tr>
-        <w:tc>
-          <w:tcPr>
-            <w:tcW w:type="dxa" w:w="4320"/>
-          </w:tcPr>
-          <w:p>
-            <w:r>
-              <w:rPr>
-                <w:sz w:val="18"/>
-              </w:rPr>
-              <w:t>Washington Post Politics</w:t>
-            </w:r>
-          </w:p>
-        </w:tc>
-        <w:tc>
-          <w:tcPr>
-            <w:tcW w:type="dxa" w:w="1728"/>
-          </w:tcPr>
-          <w:p>
-            <w:r>
-              <w:rPr>
-                <w:sz w:val="18"/>
-              </w:rPr>
-              <w:t>0</w:t>
-            </w:r>
-          </w:p>
-        </w:tc>
-        <w:tc>
-          <w:tcPr>
-            <w:tcW w:type="dxa" w:w="2304"/>
-          </w:tcPr>
-          <w:p>
-            <w:r>
-              <w:rPr>
-                <w:sz w:val="18"/>
-              </w:rPr>
-              <w:t>1</w:t>
-            </w:r>
-          </w:p>
-        </w:tc>
-        <w:tc>
-          <w:tcPr>
-            <w:tcW w:type="dxa" w:w="1728"/>
-          </w:tcPr>
-          <w:p>
-            <w:r>
-              <w:rPr>
-                <w:sz w:val="18"/>
-              </w:rPr>
-              <w:t>0.0%</w:t>
-            </w:r>
-          </w:p>
-        </w:tc>
-      </w:tr>
-      <w:tr>
-        <w:tc>
-          <w:tcPr>
-            <w:tcW w:type="dxa" w:w="4320"/>
-          </w:tcPr>
-          <w:p>
-            <w:r>
-              <w:rPr>
-                <w:sz w:val="18"/>
-              </w:rPr>
-              <w:t>ICIJ</w:t>
-            </w:r>
-          </w:p>
-        </w:tc>
-        <w:tc>
-          <w:tcPr>
-            <w:tcW w:type="dxa" w:w="1728"/>
-          </w:tcPr>
-          <w:p>
-            <w:r>
-              <w:rPr>
-                <w:sz w:val="18"/>
-              </w:rPr>
-              <w:t>0</w:t>
-            </w:r>
-          </w:p>
-        </w:tc>
-        <w:tc>
-          <w:tcPr>
-            <w:tcW w:type="dxa" w:w="2304"/>
-          </w:tcPr>
-          <w:p>
-            <w:r>
-              <w:rPr>
-                <w:sz w:val="18"/>
-              </w:rPr>
-              <w:t>1</w:t>
-            </w:r>
-          </w:p>
-        </w:tc>
-        <w:tc>
-          <w:tcPr>
-            <w:tcW w:type="dxa" w:w="1728"/>
-          </w:tcPr>
-          <w:p>
-            <w:r>
-              <w:rPr>
-                <w:sz w:val="18"/>
-              </w:rPr>
-              <w:t>0.0%</w:t>
-            </w:r>
-          </w:p>
-        </w:tc>
-      </w:tr>
-      <w:tr>
-        <w:tc>
-          <w:tcPr>
-            <w:tcW w:type="dxa" w:w="4320"/>
-          </w:tcPr>
-          <w:p>
-            <w:r>
-              <w:rPr>
-                <w:sz w:val="18"/>
-              </w:rPr>
-              <w:t>NPR</w:t>
-            </w:r>
-          </w:p>
-        </w:tc>
-        <w:tc>
-          <w:tcPr>
-            <w:tcW w:type="dxa" w:w="1728"/>
-          </w:tcPr>
-          <w:p>
-            <w:r>
-              <w:rPr>
-                <w:sz w:val="18"/>
-              </w:rPr>
-              <w:t>0</w:t>
-            </w:r>
-          </w:p>
-        </w:tc>
-        <w:tc>
-          <w:tcPr>
-            <w:tcW w:type="dxa" w:w="2304"/>
-          </w:tcPr>
-          <w:p>
-            <w:r>
-              <w:rPr>
-                <w:sz w:val="18"/>
-              </w:rPr>
-              <w:t>1</w:t>
-            </w:r>
-          </w:p>
-        </w:tc>
-        <w:tc>
-          <w:tcPr>
-            <w:tcW w:type="dxa" w:w="1728"/>
-          </w:tcPr>
-          <w:p>
-            <w:r>
-              <w:rPr>
-                <w:sz w:val="18"/>
-              </w:rPr>
-              <w:t>0.0%</w:t>
-            </w:r>
-          </w:p>
-        </w:tc>
-      </w:tr>
-      <w:tr>
-        <w:tc>
-          <w:tcPr>
-            <w:tcW w:type="dxa" w:w="4320"/>
-          </w:tcPr>
-          <w:p>
-            <w:r>
-              <w:rPr>
-                <w:sz w:val="18"/>
-              </w:rPr>
-              <w:t>The War Zone</w:t>
-            </w:r>
-          </w:p>
-        </w:tc>
-        <w:tc>
-          <w:tcPr>
-            <w:tcW w:type="dxa" w:w="1728"/>
-          </w:tcPr>
-          <w:p>
-            <w:r>
-              <w:rPr>
-                <w:sz w:val="18"/>
-              </w:rPr>
-              <w:t>0</w:t>
-            </w:r>
-          </w:p>
-        </w:tc>
-        <w:tc>
-          <w:tcPr>
-            <w:tcW w:type="dxa" w:w="2304"/>
-          </w:tcPr>
-          <w:p>
-            <w:r>
-              <w:rPr>
-                <w:sz w:val="18"/>
-              </w:rPr>
-              <w:t>7</w:t>
-            </w:r>
-          </w:p>
-        </w:tc>
-        <w:tc>
-          <w:tcPr>
-            <w:tcW w:type="dxa" w:w="1728"/>
-          </w:tcPr>
-          <w:p>
-            <w:r>
-              <w:rPr>
-                <w:sz w:val="18"/>
-              </w:rPr>
-              <w:t>0.0%</w:t>
-            </w:r>
-          </w:p>
-        </w:tc>
-      </w:tr>
-      <w:tr>
-        <w:tc>
-          <w:tcPr>
-            <w:tcW w:type="dxa" w:w="4320"/>
-          </w:tcPr>
-          <w:p>
-            <w:r>
-              <w:rPr>
-                <w:sz w:val="18"/>
-              </w:rPr>
-              <w:t>Documented</w:t>
-            </w:r>
-          </w:p>
-        </w:tc>
-        <w:tc>
-          <w:tcPr>
-            <w:tcW w:type="dxa" w:w="1728"/>
-          </w:tcPr>
-          <w:p>
-            <w:r>
-              <w:rPr>
-                <w:sz w:val="18"/>
-              </w:rPr>
-              <w:t>0</w:t>
-            </w:r>
-          </w:p>
-        </w:tc>
-        <w:tc>
-          <w:tcPr>
-            <w:tcW w:type="dxa" w:w="2304"/>
-          </w:tcPr>
-          <w:p>
-            <w:r>
-              <w:rPr>
-                <w:sz w:val="18"/>
-              </w:rPr>
-              <w:t>4</w:t>
-            </w:r>
-          </w:p>
-        </w:tc>
-        <w:tc>
-          <w:tcPr>
-            <w:tcW w:type="dxa" w:w="1728"/>
-          </w:tcPr>
-          <w:p>
-            <w:r>
-              <w:rPr>
-                <w:sz w:val="18"/>
-              </w:rPr>
-              <w:t>0.0%</w:t>
-            </w:r>
-          </w:p>
-        </w:tc>
-      </w:tr>
-      <w:tr>
-        <w:tc>
-          <w:tcPr>
-            <w:tcW w:type="dxa" w:w="4320"/>
-          </w:tcPr>
-          <w:p>
-            <w:r>
-              <w:rPr>
-                <w:sz w:val="18"/>
-              </w:rPr>
-              <w:t>Carbon Brief</w:t>
-            </w:r>
-          </w:p>
-        </w:tc>
-        <w:tc>
-          <w:tcPr>
-            <w:tcW w:type="dxa" w:w="1728"/>
-          </w:tcPr>
-          <w:p>
-            <w:r>
-              <w:rPr>
-                <w:sz w:val="18"/>
-              </w:rPr>
-              <w:t>0</w:t>
-            </w:r>
-          </w:p>
-        </w:tc>
-        <w:tc>
-          <w:tcPr>
-            <w:tcW w:type="dxa" w:w="2304"/>
-          </w:tcPr>
-          <w:p>
-            <w:r>
-              <w:rPr>
-                <w:sz w:val="18"/>
-              </w:rPr>
-              <w:t>1</w:t>
+              <w:t>2</w:t>
             </w:r>
           </w:p>
         </w:tc>
@@ -2191,7 +1705,7 @@
           </w:tcPr>
           <w:p>
             <w:r>
-              <w:t>16</w:t>
+              <w:t>14</w:t>
             </w:r>
           </w:p>
         </w:tc>
@@ -2213,7 +1727,7 @@
           </w:tcPr>
           <w:p>
             <w:r>
-              <w:t>16</w:t>
+              <w:t>7</w:t>
             </w:r>
           </w:p>
         </w:tc>
@@ -2235,51 +1749,7 @@
           </w:tcPr>
           <w:p>
             <w:r>
-              <w:t>10</w:t>
-            </w:r>
-          </w:p>
-        </w:tc>
-      </w:tr>
-      <w:tr>
-        <w:tc>
-          <w:tcPr>
-            <w:tcW w:type="dxa" w:w="4320"/>
-          </w:tcPr>
-          <w:p>
-            <w:r>
-              <w:t>headline label</w:t>
-            </w:r>
-          </w:p>
-        </w:tc>
-        <w:tc>
-          <w:tcPr>
-            <w:tcW w:type="dxa" w:w="1728"/>
-          </w:tcPr>
-          <w:p>
-            <w:r>
-              <w:t>2</w:t>
-            </w:r>
-          </w:p>
-        </w:tc>
-      </w:tr>
-      <w:tr>
-        <w:tc>
-          <w:tcPr>
-            <w:tcW w:type="dxa" w:w="4320"/>
-          </w:tcPr>
-          <w:p>
-            <w:r>
-              <w:t>institutional record</w:t>
-            </w:r>
-          </w:p>
-        </w:tc>
-        <w:tc>
-          <w:tcPr>
-            <w:tcW w:type="dxa" w:w="1728"/>
-          </w:tcPr>
-          <w:p>
-            <w:r>
-              <w:t>1</w:t>
+              <w:t>4</w:t>
             </w:r>
           </w:p>
         </w:tc>
@@ -2453,7 +1923,7 @@
               <w:rPr>
                 <w:sz w:val="17"/>
               </w:rPr>
-              <w:t>9</w:t>
+              <w:t>4</w:t>
             </w:r>
           </w:p>
         </w:tc>
@@ -2468,7 +1938,7 @@
                   <w:color w:val="1155CC"/>
                   <w:u w:val="single"/>
                 </w:rPr>
-                <w:t>As Trump's reflecting pool mess unfolded, a camera captured it all</w:t>
+                <w:t>13-year-old survivor of Michigan rampage called 911 to report she’d been shot</w:t>
               </w:r>
             </w:hyperlink>
           </w:p>
@@ -2482,7 +1952,7 @@
               <w:rPr>
                 <w:sz w:val="17"/>
               </w:rPr>
-              <w:t>ABC Australia</w:t>
+              <w:t>NBC News</w:t>
             </w:r>
           </w:p>
         </w:tc>
@@ -2495,7 +1965,6 @@
               <w:rPr>
                 <w:sz w:val="17"/>
               </w:rPr>
-              <w:t>primary source</w:t>
             </w:r>
           </w:p>
         </w:tc>
@@ -2508,7 +1977,7 @@
               <w:rPr>
                 <w:sz w:val="17"/>
               </w:rPr>
-              <w:t>4</w:t>
+              <w:t>3</w:t>
             </w:r>
           </w:p>
         </w:tc>
@@ -2548,7 +2017,7 @@
               <w:rPr>
                 <w:sz w:val="17"/>
               </w:rPr>
-              <w:t>6</w:t>
+              <w:t>2</w:t>
             </w:r>
           </w:p>
         </w:tc>
@@ -2563,7 +2032,7 @@
                   <w:color w:val="1155CC"/>
                   <w:u w:val="single"/>
                 </w:rPr>
-                <w:t>Surrogate McKenna West Allegedly Threatened With $250K Fine For Refusing Abortion</w:t>
+                <w:t>Selena Gomez Slams ‘Completely Meritless’ Wondermind Lawsuit, Will File to Dismiss ‘Baseless Claims’</w:t>
               </w:r>
             </w:hyperlink>
           </w:p>
@@ -2577,7 +2046,7 @@
               <w:rPr>
                 <w:sz w:val="17"/>
               </w:rPr>
-              <w:t>TMZ</w:t>
+              <w:t>Variety</w:t>
             </w:r>
           </w:p>
         </w:tc>
@@ -2590,7 +2059,7 @@
               <w:rPr>
                 <w:sz w:val="17"/>
               </w:rPr>
-              <w:t>exclusivity, primary source</w:t>
+              <w:t>primary source</w:t>
             </w:r>
           </w:p>
         </w:tc>
@@ -2643,7 +2112,7 @@
               <w:rPr>
                 <w:sz w:val="17"/>
               </w:rPr>
-              <w:t>6</w:t>
+              <w:t>2</w:t>
             </w:r>
           </w:p>
         </w:tc>
@@ -2658,7 +2127,7 @@
                   <w:color w:val="1155CC"/>
                   <w:u w:val="single"/>
                 </w:rPr>
-                <w:t>Regulators and banks step up scrutiny of prediction markets</w:t>
+                <w:t>Lucasfilm Co-Boss Dave Filoni On ‘Hunt For Ben Solo’ Pic Future: “The Force Is Not With Us…” – D23</w:t>
               </w:r>
             </w:hyperlink>
           </w:p>
@@ -2672,7 +2141,7 @@
               <w:rPr>
                 <w:sz w:val="17"/>
               </w:rPr>
-              <w:t>CNBC</w:t>
+              <w:t>Deadline</w:t>
             </w:r>
           </w:p>
         </w:tc>
@@ -2685,7 +2154,6 @@
               <w:rPr>
                 <w:sz w:val="17"/>
               </w:rPr>
-              <w:t>sourcing depth</w:t>
             </w:r>
           </w:p>
         </w:tc>
@@ -2738,7 +2206,7 @@
               <w:rPr>
                 <w:sz w:val="17"/>
               </w:rPr>
-              <w:t>4</w:t>
+              <w:t>2</w:t>
             </w:r>
           </w:p>
         </w:tc>
@@ -2753,7 +2221,7 @@
                   <w:color w:val="1155CC"/>
                   <w:u w:val="single"/>
                 </w:rPr>
-                <w:t>Bethenny Frankel responds to criticism from influencers of Supermodel Café menu items</w:t>
+                <w:t>Selena Gomez's Attorney Calls Fraud Accusations 'Meritless'</w:t>
               </w:r>
             </w:hyperlink>
           </w:p>
@@ -2767,7 +2235,7 @@
               <w:rPr>
                 <w:sz w:val="17"/>
               </w:rPr>
-              <w:t>Page Six</w:t>
+              <w:t>TMZ</w:t>
             </w:r>
           </w:p>
         </w:tc>
@@ -2780,6 +2248,7 @@
               <w:rPr>
                 <w:sz w:val="17"/>
               </w:rPr>
+              <w:t>primary source</w:t>
             </w:r>
           </w:p>
         </w:tc>
@@ -2792,7 +2261,7 @@
               <w:rPr>
                 <w:sz w:val="17"/>
               </w:rPr>
-              <w:t>3</w:t>
+              <w:t>1</w:t>
             </w:r>
           </w:p>
         </w:tc>
@@ -2832,7 +2301,7 @@
               <w:rPr>
                 <w:sz w:val="17"/>
               </w:rPr>
-              <w:t>3</w:t>
+              <w:t>2</w:t>
             </w:r>
           </w:p>
         </w:tc>
@@ -2847,7 +2316,7 @@
                   <w:color w:val="1155CC"/>
                   <w:u w:val="single"/>
                 </w:rPr>
-                <w:t>‘Spider-Man: Beyond The Spider-Verse’ Trailer Leaks Online, Co-Writer Chris Miller Says He’s “Not A Fan Of Leaks Of Unfinished Footage”</w:t>
+                <w:t>Fuel security or electrification? We've crunched the numbers</w:t>
               </w:r>
             </w:hyperlink>
           </w:p>
@@ -2861,7 +2330,7 @@
               <w:rPr>
                 <w:sz w:val="17"/>
               </w:rPr>
-              <w:t>Deadline</w:t>
+              <w:t>ABC Australia</w:t>
             </w:r>
           </w:p>
         </w:tc>
@@ -2874,7 +2343,6 @@
               <w:rPr>
                 <w:sz w:val="17"/>
               </w:rPr>
-              <w:t>primary source</w:t>
             </w:r>
           </w:p>
         </w:tc>
@@ -2887,7 +2355,7 @@
               <w:rPr>
                 <w:sz w:val="17"/>
               </w:rPr>
-              <w:t>1</w:t>
+              <w:t>2</w:t>
             </w:r>
           </w:p>
         </w:tc>
@@ -2927,7 +2395,7 @@
               <w:rPr>
                 <w:sz w:val="17"/>
               </w:rPr>
-              <w:t>3</w:t>
+              <w:t>2</w:t>
             </w:r>
           </w:p>
         </w:tc>
@@ -2942,7 +2410,7 @@
                   <w:color w:val="1155CC"/>
                   <w:u w:val="single"/>
                 </w:rPr>
-                <w:t>James Pearce Jr. Suspended For Rickea Jackson Domestic Dispute</w:t>
+                <w:t>Dream becomes reality as couple takes over outback pub</w:t>
               </w:r>
             </w:hyperlink>
           </w:p>
@@ -2956,7 +2424,7 @@
               <w:rPr>
                 <w:sz w:val="17"/>
               </w:rPr>
-              <w:t>TMZ</w:t>
+              <w:t>ABC Australia</w:t>
             </w:r>
           </w:p>
         </w:tc>
@@ -2969,7 +2437,6 @@
               <w:rPr>
                 <w:sz w:val="17"/>
               </w:rPr>
-              <w:t>primary source</w:t>
             </w:r>
           </w:p>
         </w:tc>
@@ -2982,7 +2449,7 @@
               <w:rPr>
                 <w:sz w:val="17"/>
               </w:rPr>
-              <w:t>1</w:t>
+              <w:t>2</w:t>
             </w:r>
           </w:p>
         </w:tc>
@@ -3022,7 +2489,7 @@
               <w:rPr>
                 <w:sz w:val="17"/>
               </w:rPr>
-              <w:t>3</w:t>
+              <w:t>2</w:t>
             </w:r>
           </w:p>
         </w:tc>
@@ -3037,7 +2504,7 @@
                   <w:color w:val="1155CC"/>
                   <w:u w:val="single"/>
                 </w:rPr>
-                <w:t>How to get a refund for Trump tariffs struck down by Supreme Court</w:t>
+                <w:t>Volunteering changes lives and fills community gaps across the country</w:t>
               </w:r>
             </w:hyperlink>
           </w:p>
@@ -3051,7 +2518,7 @@
               <w:rPr>
                 <w:sz w:val="17"/>
               </w:rPr>
-              <w:t>CBS News</w:t>
+              <w:t>ABC Australia</w:t>
             </w:r>
           </w:p>
         </w:tc>
@@ -3064,7 +2531,6 @@
               <w:rPr>
                 <w:sz w:val="17"/>
               </w:rPr>
-              <w:t>primary source</w:t>
             </w:r>
           </w:p>
         </w:tc>
@@ -3077,7 +2543,7 @@
               <w:rPr>
                 <w:sz w:val="17"/>
               </w:rPr>
-              <w:t>1</w:t>
+              <w:t>2</w:t>
             </w:r>
           </w:p>
         </w:tc>
@@ -3132,7 +2598,7 @@
                   <w:color w:val="1155CC"/>
                   <w:u w:val="single"/>
                 </w:rPr>
-                <w:t>Sean Dorney was a roaming ABC reporter. Now, just getting out of bed is a struggle</w:t>
+                <w:t>Earthquake survivors 'still on alert' after dozens killed in Indonesia</w:t>
               </w:r>
             </w:hyperlink>
           </w:p>
@@ -3226,7 +2692,7 @@
                   <w:color w:val="1155CC"/>
                   <w:u w:val="single"/>
                 </w:rPr>
-                <w:t>As the only Texas district to trigger potential state takeover, Austin ISD’s future now in TEA’s hands</w:t>
+                <w:t>South Carolina to hold first 2028 Democratic presidential primary</w:t>
               </w:r>
             </w:hyperlink>
           </w:p>
@@ -3240,7 +2706,7 @@
               <w:rPr>
                 <w:sz w:val="17"/>
               </w:rPr>
-              <w:t>Texas Tribune</w:t>
+              <w:t>CBS News</w:t>
             </w:r>
           </w:p>
         </w:tc>
@@ -3305,7 +2771,7 @@
               <w:rPr>
                 <w:sz w:val="17"/>
               </w:rPr>
-              <w:t>2</w:t>
+              <w:t>1</w:t>
             </w:r>
           </w:p>
         </w:tc>
@@ -3320,7 +2786,7 @@
                   <w:color w:val="1155CC"/>
                   <w:u w:val="single"/>
                 </w:rPr>
-                <w:t>‘Tinderbox’ Britain bans disposable barbecues, sends nationwide fire alerts as Europe battles blazes</w:t>
+                <w:t>Pattern Beauty just launched a new styling tool for natural hair — here’s everything you should know</w:t>
               </w:r>
             </w:hyperlink>
           </w:p>
@@ -3347,6 +2813,7 @@
               <w:rPr>
                 <w:sz w:val="17"/>
               </w:rPr>
+              <w:t>exclusivity</w:t>
             </w:r>
           </w:p>
         </w:tc>
@@ -3359,7 +2826,7 @@
               <w:rPr>
                 <w:sz w:val="17"/>
               </w:rPr>
-              <w:t>2</w:t>
+              <w:t>1</w:t>
             </w:r>
           </w:p>
         </w:tc>
@@ -3399,7 +2866,7 @@
               <w:rPr>
                 <w:sz w:val="17"/>
               </w:rPr>
-              <w:t>2</w:t>
+              <w:t>8</w:t>
             </w:r>
           </w:p>
         </w:tc>
@@ -3414,7 +2881,7 @@
                   <w:color w:val="1155CC"/>
                   <w:u w:val="single"/>
                 </w:rPr>
-                <w:t>Alex Murdaugh granted change of venue for murder retrial, past testimony allowed</w:t>
+                <w:t>Nvidia Nears Deal To Guarantee About $100 Billion In Financing For Massive Data Center</w:t>
               </w:r>
             </w:hyperlink>
           </w:p>
@@ -3428,7 +2895,7 @@
               <w:rPr>
                 <w:sz w:val="17"/>
               </w:rPr>
-              <w:t>NBC News</w:t>
+              <w:t>The Information</w:t>
             </w:r>
           </w:p>
         </w:tc>
@@ -3441,6 +2908,7 @@
               <w:rPr>
                 <w:sz w:val="17"/>
               </w:rPr>
+              <w:t>sourcing depth</w:t>
             </w:r>
           </w:p>
         </w:tc>
@@ -3453,7 +2921,7 @@
               <w:rPr>
                 <w:sz w:val="17"/>
               </w:rPr>
-              <w:t>2</w:t>
+              <w:t>3</w:t>
             </w:r>
           </w:p>
         </w:tc>
@@ -3466,6 +2934,7 @@
               <w:rPr>
                 <w:sz w:val="17"/>
               </w:rPr>
+              <w:t>The Information</w:t>
             </w:r>
           </w:p>
         </w:tc>
@@ -3493,7 +2962,7 @@
               <w:rPr>
                 <w:sz w:val="17"/>
               </w:rPr>
-              <w:t>2</w:t>
+              <w:t>6</w:t>
             </w:r>
           </w:p>
         </w:tc>
@@ -3508,7 +2977,7 @@
                   <w:color w:val="1155CC"/>
                   <w:u w:val="single"/>
                 </w:rPr>
-                <w:t>Warren demands answers from RFK Jr. on 'calamitous' cyclosporiasis outbreak response</w:t>
+                <w:t>Jane Street lost $15 billion in its first down month in a decade</w:t>
               </w:r>
             </w:hyperlink>
           </w:p>
@@ -3522,7 +2991,7 @@
               <w:rPr>
                 <w:sz w:val="17"/>
               </w:rPr>
-              <w:t>ABC News</w:t>
+              <w:t>Fortune</w:t>
             </w:r>
           </w:p>
         </w:tc>
@@ -3547,7 +3016,7 @@
               <w:rPr>
                 <w:sz w:val="17"/>
               </w:rPr>
-              <w:t>2</w:t>
+              <w:t>4</w:t>
             </w:r>
           </w:p>
         </w:tc>
@@ -3587,7 +3056,7 @@
               <w:rPr>
                 <w:sz w:val="17"/>
               </w:rPr>
-              <w:t>2</w:t>
+              <w:t>6</w:t>
             </w:r>
           </w:p>
         </w:tc>
@@ -3602,7 +3071,7 @@
                   <w:color w:val="1155CC"/>
                   <w:u w:val="single"/>
                 </w:rPr>
-                <w:t>Read-it-later app Pocket shut down — here are the best alternatives</w:t>
+                <w:t>10 delicious and safe summer salad recipes during cyclospora outbreak</w:t>
               </w:r>
             </w:hyperlink>
           </w:p>
@@ -3616,7 +3085,7 @@
               <w:rPr>
                 <w:sz w:val="17"/>
               </w:rPr>
-              <w:t>TechCrunch</w:t>
+              <w:t>The Guardian US</w:t>
             </w:r>
           </w:p>
         </w:tc>
@@ -3641,7 +3110,7 @@
               <w:rPr>
                 <w:sz w:val="17"/>
               </w:rPr>
-              <w:t>2</w:t>
+              <w:t>7</w:t>
             </w:r>
           </w:p>
         </w:tc>
@@ -3681,7 +3150,7 @@
               <w:rPr>
                 <w:sz w:val="17"/>
               </w:rPr>
-              <w:t>1</w:t>
+              <w:t>4</w:t>
             </w:r>
           </w:p>
         </w:tc>
@@ -3696,7 +3165,7 @@
                   <w:color w:val="1155CC"/>
                   <w:u w:val="single"/>
                 </w:rPr>
-                <w:t>Squishmallows Movie in the Works at Amazon MGM (EXCLUSIVE)</w:t>
+                <w:t>Major incidents across UK put firefighters under 'incredible pressure', fire chief says</w:t>
               </w:r>
             </w:hyperlink>
           </w:p>
@@ -3710,7 +3179,7 @@
               <w:rPr>
                 <w:sz w:val="17"/>
               </w:rPr>
-              <w:t>Variety</w:t>
+              <w:t>BBC News</w:t>
             </w:r>
           </w:p>
         </w:tc>
@@ -3723,7 +3192,6 @@
               <w:rPr>
                 <w:sz w:val="17"/>
               </w:rPr>
-              <w:t>exclusivity</w:t>
             </w:r>
           </w:p>
         </w:tc>
@@ -3736,7 +3204,7 @@
               <w:rPr>
                 <w:sz w:val="17"/>
               </w:rPr>
-              <w:t>1</w:t>
+              <w:t>3</w:t>
             </w:r>
           </w:p>
         </w:tc>
@@ -3776,7 +3244,7 @@
               <w:rPr>
                 <w:sz w:val="17"/>
               </w:rPr>
-              <w:t>1</w:t>
+              <w:t>4</w:t>
             </w:r>
           </w:p>
         </w:tc>
@@ -3791,7 +3259,7 @@
                   <w:color w:val="1155CC"/>
                   <w:u w:val="single"/>
                 </w:rPr>
-                <w:t>‘Deli Boys’ Canceled After Two Seasons At Hulu</w:t>
+                <w:t>Netflix Asks Judge to Toss Tyra Banks' Defamation Lawsuit Over Docuseries</w:t>
               </w:r>
             </w:hyperlink>
           </w:p>
@@ -3805,7 +3273,7 @@
               <w:rPr>
                 <w:sz w:val="17"/>
               </w:rPr>
-              <w:t>Deadline</w:t>
+              <w:t>TMZ</w:t>
             </w:r>
           </w:p>
         </w:tc>
@@ -3818,7 +3286,7 @@
               <w:rPr>
                 <w:sz w:val="17"/>
               </w:rPr>
-              <w:t>exclusivity</w:t>
+              <w:t>exclusivity, primary source</w:t>
             </w:r>
           </w:p>
         </w:tc>
@@ -3871,7 +3339,7 @@
               <w:rPr>
                 <w:sz w:val="17"/>
               </w:rPr>
-              <w:t>1</w:t>
+              <w:t>4</w:t>
             </w:r>
           </w:p>
         </w:tc>
@@ -3886,7 +3354,7 @@
                   <w:color w:val="1155CC"/>
                   <w:u w:val="single"/>
                 </w:rPr>
-                <w:t>‘Scrubs’ Adds Keyla Monterroso Mejia As New Nurse In Season 2 Of ABC Reboot</w:t>
+                <w:t>Trump pulls last aircraft carrier in Asia to send to Mideast, and China ‘is quite happy with U.S. distraction’ as Beijing shows signs of aggression</w:t>
               </w:r>
             </w:hyperlink>
           </w:p>
@@ -3900,7 +3368,7 @@
               <w:rPr>
                 <w:sz w:val="17"/>
               </w:rPr>
-              <w:t>Deadline</w:t>
+              <w:t>Fortune</w:t>
             </w:r>
           </w:p>
         </w:tc>
@@ -3913,7 +3381,6 @@
               <w:rPr>
                 <w:sz w:val="17"/>
               </w:rPr>
-              <w:t>exclusivity</w:t>
             </w:r>
           </w:p>
         </w:tc>
@@ -3926,7 +3393,7 @@
               <w:rPr>
                 <w:sz w:val="17"/>
               </w:rPr>
-              <w:t>1</w:t>
+              <w:t>3</w:t>
             </w:r>
           </w:p>
         </w:tc>
@@ -3939,6 +3406,7 @@
               <w:rPr>
                 <w:sz w:val="17"/>
               </w:rPr>
+              <w:t>ABC News</w:t>
             </w:r>
           </w:p>
         </w:tc>
@@ -3966,7 +3434,7 @@
               <w:rPr>
                 <w:sz w:val="17"/>
               </w:rPr>
-              <w:t>1</w:t>
+              <w:t>4</w:t>
             </w:r>
           </w:p>
         </w:tc>
@@ -3981,7 +3449,7 @@
                   <w:color w:val="1155CC"/>
                   <w:u w:val="single"/>
                 </w:rPr>
-                <w:t>‘RHOC’ recap: Heather attempts to ‘break up’ Gina, Emily friendship</w:t>
+                <w:t>Anthropic revenue surges to over $11.5 billion in second quarter</w:t>
               </w:r>
             </w:hyperlink>
           </w:p>
@@ -3995,7 +3463,7 @@
               <w:rPr>
                 <w:sz w:val="17"/>
               </w:rPr>
-              <w:t>Page Six</w:t>
+              <w:t>Fortune</w:t>
             </w:r>
           </w:p>
         </w:tc>
@@ -4008,7 +3476,6 @@
               <w:rPr>
                 <w:sz w:val="17"/>
               </w:rPr>
-              <w:t>exclusivity</w:t>
             </w:r>
           </w:p>
         </w:tc>
@@ -4021,7 +3488,7 @@
               <w:rPr>
                 <w:sz w:val="17"/>
               </w:rPr>
-              <w:t>1</w:t>
+              <w:t>3</w:t>
             </w:r>
           </w:p>
         </w:tc>
@@ -4061,7 +3528,7 @@
               <w:rPr>
                 <w:sz w:val="17"/>
               </w:rPr>
-              <w:t>10</w:t>
+              <w:t>4</w:t>
             </w:r>
           </w:p>
         </w:tc>
@@ -4076,7 +3543,7 @@
                   <w:color w:val="1155CC"/>
                   <w:u w:val="single"/>
                 </w:rPr>
-                <w:t>Violent crime plummeted in U.S. last year, White House official says</w:t>
+                <w:t>2nd earthquake hits Indonesia following powerful magnitude 7.7 quake</w:t>
               </w:r>
             </w:hyperlink>
           </w:p>
@@ -4090,7 +3557,7 @@
               <w:rPr>
                 <w:sz w:val="17"/>
               </w:rPr>
-              <w:t>CBS News</w:t>
+              <w:t>ABC News</w:t>
             </w:r>
           </w:p>
         </w:tc>
@@ -4103,7 +3570,6 @@
               <w:rPr>
                 <w:sz w:val="17"/>
               </w:rPr>
-              <w:t>sourcing depth</w:t>
             </w:r>
           </w:p>
         </w:tc>
@@ -4116,7 +3582,7 @@
               <w:rPr>
                 <w:sz w:val="17"/>
               </w:rPr>
-              <w:t>4</w:t>
+              <w:t>3</w:t>
             </w:r>
           </w:p>
         </w:tc>
@@ -4156,7 +3622,7 @@
               <w:rPr>
                 <w:sz w:val="17"/>
               </w:rPr>
-              <w:t>8</w:t>
+              <w:t>4</w:t>
             </w:r>
           </w:p>
         </w:tc>
@@ -4171,7 +3637,7 @@
                   <w:color w:val="1155CC"/>
                   <w:u w:val="single"/>
                 </w:rPr>
-                <w:t>Aaron Sorkin on why he's optimistic about AI: 'I don't think it's going to work'</w:t>
+                <w:t>Air traffic controller saves day when 2 jets with same call number converge</w:t>
               </w:r>
             </w:hyperlink>
           </w:p>
@@ -4185,7 +3651,7 @@
               <w:rPr>
                 <w:sz w:val="17"/>
               </w:rPr>
-              <w:t>Business Insider</w:t>
+              <w:t>CBS News</w:t>
             </w:r>
           </w:p>
         </w:tc>
@@ -4198,7 +3664,6 @@
               <w:rPr>
                 <w:sz w:val="17"/>
               </w:rPr>
-              <w:t>primary source</w:t>
             </w:r>
           </w:p>
         </w:tc>
@@ -4211,7 +3676,7 @@
               <w:rPr>
                 <w:sz w:val="17"/>
               </w:rPr>
-              <w:t>1</w:t>
+              <w:t>3</w:t>
             </w:r>
           </w:p>
         </w:tc>
@@ -4251,7 +3716,7 @@
               <w:rPr>
                 <w:sz w:val="17"/>
               </w:rPr>
-              <w:t>8</w:t>
+              <w:t>3</w:t>
             </w:r>
           </w:p>
         </w:tc>
@@ -4266,7 +3731,7 @@
                   <w:color w:val="1155CC"/>
                   <w:u w:val="single"/>
                 </w:rPr>
-                <w:t>Shein eyes a valuation rivalling H&amp;M. Will the market buy it?</w:t>
+                <w:t>DOJ refers to Air Force One threat as ‘assassination attempt’ in ballroom appeal</w:t>
               </w:r>
             </w:hyperlink>
           </w:p>
@@ -4280,7 +3745,7 @@
               <w:rPr>
                 <w:sz w:val="17"/>
               </w:rPr>
-              <w:t>South China Morning Post</w:t>
+              <w:t>The Hill</w:t>
             </w:r>
           </w:p>
         </w:tc>
@@ -4293,7 +3758,7 @@
               <w:rPr>
                 <w:sz w:val="17"/>
               </w:rPr>
-              <w:t>primary source, sourcing depth</w:t>
+              <w:t>primary source</w:t>
             </w:r>
           </w:p>
         </w:tc>
@@ -4346,7 +3811,7 @@
               <w:rPr>
                 <w:sz w:val="17"/>
               </w:rPr>
-              <w:t>6</w:t>
+              <w:t>2</w:t>
             </w:r>
           </w:p>
         </w:tc>
@@ -4361,7 +3826,7 @@
                   <w:color w:val="1155CC"/>
                   <w:u w:val="single"/>
                 </w:rPr>
-                <w:t>American missionary Kevin Rideout released after 9 months in captivity in Niger</w:t>
+                <w:t>Dorian TV Awards 2026 Winners Include ‘Heated Rivalry’, ‘Hacks’ Final Season &amp; More — Full List</w:t>
               </w:r>
             </w:hyperlink>
           </w:p>
@@ -4375,7 +3840,7 @@
               <w:rPr>
                 <w:sz w:val="17"/>
               </w:rPr>
-              <w:t>ABC News</w:t>
+              <w:t>Deadline</w:t>
             </w:r>
           </w:p>
         </w:tc>
@@ -4400,7 +3865,7 @@
               <w:rPr>
                 <w:sz w:val="17"/>
               </w:rPr>
-              <w:t>4</w:t>
+              <w:t>2</w:t>
             </w:r>
           </w:p>
         </w:tc>
@@ -4440,7 +3905,7 @@
               <w:rPr>
                 <w:sz w:val="17"/>
               </w:rPr>
-              <w:t>6</w:t>
+              <w:t>2</w:t>
             </w:r>
           </w:p>
         </w:tc>
@@ -4455,7 +3920,7 @@
                   <w:color w:val="1155CC"/>
                   <w:u w:val="single"/>
                 </w:rPr>
-                <w:t>Ex-Jets Star Allen Lazard, Former Miss Peru Camila Escribens Split, End Engagement</w:t>
+                <w:t>'Revenge of the Nerds' star Robert Carradine's family sues UCLA over his death</w:t>
               </w:r>
             </w:hyperlink>
           </w:p>
@@ -4469,7 +3934,7 @@
               <w:rPr>
                 <w:sz w:val="17"/>
               </w:rPr>
-              <w:t>TMZ</w:t>
+              <w:t>Los Angeles Times</w:t>
             </w:r>
           </w:p>
         </w:tc>
@@ -4482,7 +3947,7 @@
               <w:rPr>
                 <w:sz w:val="17"/>
               </w:rPr>
-              <w:t>exclusivity, sourcing depth</w:t>
+              <w:t>primary source</w:t>
             </w:r>
           </w:p>
         </w:tc>
@@ -4535,7 +4000,7 @@
               <w:rPr>
                 <w:sz w:val="17"/>
               </w:rPr>
-              <w:t>6</w:t>
+              <w:t>2</w:t>
             </w:r>
           </w:p>
         </w:tc>
@@ -4550,7 +4015,7 @@
                   <w:color w:val="1155CC"/>
                   <w:u w:val="single"/>
                 </w:rPr>
-                <w:t>Tropical Storm Lala forecast and track: Storm expected to become hurricane</w:t>
+                <w:t>Inside the Psych Evaluation Diagnosing Bryan Kohberger with Autism, OCD, ADHD, More</w:t>
               </w:r>
             </w:hyperlink>
           </w:p>
@@ -4564,7 +4029,7 @@
               <w:rPr>
                 <w:sz w:val="17"/>
               </w:rPr>
-              <w:t>ABC News</w:t>
+              <w:t>TMZ</w:t>
             </w:r>
           </w:p>
         </w:tc>
@@ -4577,6 +4042,7 @@
               <w:rPr>
                 <w:sz w:val="17"/>
               </w:rPr>
+              <w:t>exclusivity</w:t>
             </w:r>
           </w:p>
         </w:tc>
@@ -4589,7 +4055,7 @@
               <w:rPr>
                 <w:sz w:val="17"/>
               </w:rPr>
-              <w:t>4</w:t>
+              <w:t>1</w:t>
             </w:r>
           </w:p>
         </w:tc>
@@ -4629,7 +4095,7 @@
               <w:rPr>
                 <w:sz w:val="17"/>
               </w:rPr>
-              <w:t>6</w:t>
+              <w:t>2</w:t>
             </w:r>
           </w:p>
         </w:tc>
@@ -4644,7 +4110,7 @@
                   <w:color w:val="1155CC"/>
                   <w:u w:val="single"/>
                 </w:rPr>
-                <w:t>Gen Z and millennials have it far worse than my generation. Here's why | Opinion</w:t>
+                <w:t>Homes across B.C. have been decimated by wildfires. Here's what to know about your insurance</w:t>
               </w:r>
             </w:hyperlink>
           </w:p>
@@ -4658,7 +4124,7 @@
               <w:rPr>
                 <w:sz w:val="17"/>
               </w:rPr>
-              <w:t>The Guardian US</w:t>
+              <w:t>CBC News</w:t>
             </w:r>
           </w:p>
         </w:tc>
@@ -4683,7 +4149,7 @@
               <w:rPr>
                 <w:sz w:val="17"/>
               </w:rPr>
-              <w:t>4</w:t>
+              <w:t>2</w:t>
             </w:r>
           </w:p>
         </w:tc>
@@ -4723,7 +4189,7 @@
               <w:rPr>
                 <w:sz w:val="17"/>
               </w:rPr>
-              <w:t>6</w:t>
+              <w:t>2</w:t>
             </w:r>
           </w:p>
         </w:tc>
@@ -4738,7 +4204,7 @@
                   <w:color w:val="1155CC"/>
                   <w:u w:val="single"/>
                 </w:rPr>
-                <w:t>Scoop: Key W.H. national security aide Andy Baker is departing</w:t>
+                <w:t>Trump embraces a political strategy of being in charge of everything but responsible for nothing when things go badly</w:t>
               </w:r>
             </w:hyperlink>
           </w:p>
@@ -4752,7 +4218,7 @@
               <w:rPr>
                 <w:sz w:val="17"/>
               </w:rPr>
-              <w:t>Axios</w:t>
+              <w:t>Fortune</w:t>
             </w:r>
           </w:p>
         </w:tc>
@@ -4765,7 +4231,6 @@
               <w:rPr>
                 <w:sz w:val="17"/>
               </w:rPr>
-              <w:t>exclusivity, headline label</w:t>
             </w:r>
           </w:p>
         </w:tc>
@@ -4818,7 +4283,7 @@
               <w:rPr>
                 <w:sz w:val="17"/>
               </w:rPr>
-              <w:t>6</w:t>
+              <w:t>2</w:t>
             </w:r>
           </w:p>
         </w:tc>
@@ -4833,7 +4298,7 @@
                   <w:color w:val="1155CC"/>
                   <w:u w:val="single"/>
                 </w:rPr>
-                <w:t>Officials said no credible threat to Trump ahead of Air Force One switch: Sources</w:t>
+                <w:t>Nvidia has $21 billion SpaceX stake, $30 billion in Intel shares</w:t>
               </w:r>
             </w:hyperlink>
           </w:p>
@@ -4847,7 +4312,7 @@
               <w:rPr>
                 <w:sz w:val="17"/>
               </w:rPr>
-              <w:t>ABC News</w:t>
+              <w:t>Fortune</w:t>
             </w:r>
           </w:p>
         </w:tc>
@@ -4872,7 +4337,7 @@
               <w:rPr>
                 <w:sz w:val="17"/>
               </w:rPr>
-              <w:t>6</w:t>
+              <w:t>2</w:t>
             </w:r>
           </w:p>
         </w:tc>
@@ -4912,7 +4377,7 @@
               <w:rPr>
                 <w:sz w:val="17"/>
               </w:rPr>
-              <w:t>6</w:t>
+              <w:t>2</w:t>
             </w:r>
           </w:p>
         </w:tc>
@@ -4927,7 +4392,7 @@
                   <w:color w:val="1155CC"/>
                   <w:u w:val="single"/>
                 </w:rPr>
-                <w:t>Trump’s great plane escape – podcast</w:t>
+                <w:t>Berkshire pads Delta, Alphabet stakes as Abel taps cash pile</w:t>
               </w:r>
             </w:hyperlink>
           </w:p>
@@ -4941,7 +4406,7 @@
               <w:rPr>
                 <w:sz w:val="17"/>
               </w:rPr>
-              <w:t>The Guardian US</w:t>
+              <w:t>Fortune</w:t>
             </w:r>
           </w:p>
         </w:tc>
@@ -4966,7 +4431,7 @@
               <w:rPr>
                 <w:sz w:val="17"/>
               </w:rPr>
-              <w:t>4</w:t>
+              <w:t>2</w:t>
             </w:r>
           </w:p>
         </w:tc>
@@ -5006,7 +4471,7 @@
               <w:rPr>
                 <w:sz w:val="17"/>
               </w:rPr>
-              <w:t>6</w:t>
+              <w:t>2</w:t>
             </w:r>
           </w:p>
         </w:tc>
@@ -5021,7 +4486,7 @@
                   <w:color w:val="1155CC"/>
                   <w:u w:val="single"/>
                 </w:rPr>
-                <w:t>Evidence of bird strike after man nearly sucked out of plane window, NTSB says</w:t>
+                <w:t>Trump accuses nonprofit organization of revealing ‘top military secrets’ in ballroom case</w:t>
               </w:r>
             </w:hyperlink>
           </w:p>
@@ -5035,7 +4500,7 @@
               <w:rPr>
                 <w:sz w:val="17"/>
               </w:rPr>
-              <w:t>CBS News</w:t>
+              <w:t>The Hill</w:t>
             </w:r>
           </w:p>
         </w:tc>
@@ -5048,7 +4513,7 @@
               <w:rPr>
                 <w:sz w:val="17"/>
               </w:rPr>
-              <w:t>institutional record</w:t>
+              <w:t>primary source</w:t>
             </w:r>
           </w:p>
         </w:tc>
@@ -5061,7 +4526,7 @@
               <w:rPr>
                 <w:sz w:val="17"/>
               </w:rPr>
-              <w:t>2</w:t>
+              <w:t>1</w:t>
             </w:r>
           </w:p>
         </w:tc>
@@ -5101,7 +4566,7 @@
               <w:rPr>
                 <w:sz w:val="17"/>
               </w:rPr>
-              <w:t>5</w:t>
+              <w:t>2</w:t>
             </w:r>
           </w:p>
         </w:tc>
@@ -5116,7 +4581,7 @@
                   <w:color w:val="1155CC"/>
                   <w:u w:val="single"/>
                 </w:rPr>
-                <w:t>Marcellus Wiley’s Estranged Wife Wants Him to Cough Up $200k Amid Restraining Order Battle</w:t>
+                <w:t>Quick hits: Smith sets review record after horror drop, Warner jinxes Marnus</w:t>
               </w:r>
             </w:hyperlink>
           </w:p>
@@ -5130,7 +4595,7 @@
               <w:rPr>
                 <w:sz w:val="17"/>
               </w:rPr>
-              <w:t>TMZ</w:t>
+              <w:t>ABC Australia</w:t>
             </w:r>
           </w:p>
         </w:tc>
@@ -5143,7 +4608,6 @@
               <w:rPr>
                 <w:sz w:val="17"/>
               </w:rPr>
-              <w:t>exclusivity, primary source</w:t>
             </w:r>
           </w:p>
         </w:tc>
@@ -5156,7 +4620,7 @@
               <w:rPr>
                 <w:sz w:val="17"/>
               </w:rPr>
-              <w:t>1</w:t>
+              <w:t>2</w:t>
             </w:r>
           </w:p>
         </w:tc>
@@ -5196,7 +4660,7 @@
               <w:rPr>
                 <w:sz w:val="17"/>
               </w:rPr>
-              <w:t>5</w:t>
+              <w:t>2</w:t>
             </w:r>
           </w:p>
         </w:tc>
@@ -5211,7 +4675,7 @@
                   <w:color w:val="1155CC"/>
                   <w:u w:val="single"/>
                 </w:rPr>
-                <w:t>Surrogate McKenna West's Emotional Demand to Cancel Abortion, Read the Letters</w:t>
+                <w:t>Can a Dam Expansion Hold Back Climate Considerations on the Colorado River?</w:t>
               </w:r>
             </w:hyperlink>
           </w:p>
@@ -5225,7 +4689,7 @@
               <w:rPr>
                 <w:sz w:val="17"/>
               </w:rPr>
-              <w:t>TMZ</w:t>
+              <w:t>Inside Climate News</w:t>
             </w:r>
           </w:p>
         </w:tc>
@@ -5238,7 +4702,7 @@
               <w:rPr>
                 <w:sz w:val="17"/>
               </w:rPr>
-              <w:t>exclusivity, primary source</w:t>
+              <w:t>primary source</w:t>
             </w:r>
           </w:p>
         </w:tc>
@@ -5291,7 +4755,7 @@
               <w:rPr>
                 <w:sz w:val="17"/>
               </w:rPr>
-              <w:t>5</w:t>
+              <w:t>9</w:t>
             </w:r>
           </w:p>
         </w:tc>
@@ -5306,7 +4770,7 @@
                   <w:color w:val="1155CC"/>
                   <w:u w:val="single"/>
                 </w:rPr>
-                <w:t>Feds charge woman for allegedly vandalizing World War II Memorial in D.C.</w:t>
+                <w:t>McKenna West Says Child With Same Heart Defect as Baby Gabriel Is Now 'Thriving'</w:t>
               </w:r>
             </w:hyperlink>
           </w:p>
@@ -5320,7 +4784,7 @@
               <w:rPr>
                 <w:sz w:val="17"/>
               </w:rPr>
-              <w:t>CBS News</w:t>
+              <w:t>TMZ</w:t>
             </w:r>
           </w:p>
         </w:tc>
@@ -5333,7 +4797,7 @@
               <w:rPr>
                 <w:sz w:val="17"/>
               </w:rPr>
-              <w:t>primary source</w:t>
+              <w:t>exclusivity, primary source, sourcing depth</w:t>
             </w:r>
           </w:p>
         </w:tc>
@@ -5346,7 +4810,7 @@
               <w:rPr>
                 <w:sz w:val="17"/>
               </w:rPr>
-              <w:t>2</w:t>
+              <w:t>1</w:t>
             </w:r>
           </w:p>
         </w:tc>
@@ -5359,6 +4823,7 @@
               <w:rPr>
                 <w:sz w:val="17"/>
               </w:rPr>
+              <w:t>TMZ</w:t>
             </w:r>
           </w:p>
         </w:tc>
@@ -5386,7 +4851,7 @@
               <w:rPr>
                 <w:sz w:val="17"/>
               </w:rPr>
-              <w:t>5</w:t>
+              <w:t>6</w:t>
             </w:r>
           </w:p>
         </w:tc>
@@ -5401,7 +4866,7 @@
                   <w:color w:val="1155CC"/>
                   <w:u w:val="single"/>
                 </w:rPr>
-                <w:t>Surrogate McKenna West Vows Supreme Court Fight Over Baby</w:t>
+                <w:t>Lawsuit alleges Sony investigated WPP's media operation and said it ran a 'global crime scheme'</w:t>
               </w:r>
             </w:hyperlink>
           </w:p>
@@ -5415,7 +4880,7 @@
               <w:rPr>
                 <w:sz w:val="17"/>
               </w:rPr>
-              <w:t>TMZ</w:t>
+              <w:t>Business Insider</w:t>
             </w:r>
           </w:p>
         </w:tc>
@@ -5428,7 +4893,7 @@
               <w:rPr>
                 <w:sz w:val="17"/>
               </w:rPr>
-              <w:t>exclusivity, primary source</w:t>
+              <w:t>primary source</w:t>
             </w:r>
           </w:p>
         </w:tc>
@@ -5481,7 +4946,7 @@
               <w:rPr>
                 <w:sz w:val="17"/>
               </w:rPr>
-              <w:t>5</w:t>
+              <w:t>6</w:t>
             </w:r>
           </w:p>
         </w:tc>
@@ -5496,7 +4961,7 @@
                   <w:color w:val="1155CC"/>
                   <w:u w:val="single"/>
                 </w:rPr>
-                <w:t>Taylor Frankie Paul's Ex-Husband Tate Asks Court To Unseal Drug Test Results</w:t>
+                <w:t>Why does everything feel meh? We're in the era of joyless decadence – Stateside with Kai and Carter</w:t>
               </w:r>
             </w:hyperlink>
           </w:p>
@@ -5510,7 +4975,7 @@
               <w:rPr>
                 <w:sz w:val="17"/>
               </w:rPr>
-              <w:t>TMZ</w:t>
+              <w:t>The Guardian US</w:t>
             </w:r>
           </w:p>
         </w:tc>
@@ -5523,7 +4988,6 @@
               <w:rPr>
                 <w:sz w:val="17"/>
               </w:rPr>
-              <w:t>exclusivity, primary source</w:t>
             </w:r>
           </w:p>
         </w:tc>
@@ -5536,7 +5000,7 @@
               <w:rPr>
                 <w:sz w:val="17"/>
               </w:rPr>
-              <w:t>1</w:t>
+              <w:t>5</w:t>
             </w:r>
           </w:p>
         </w:tc>
@@ -5591,7 +5055,7 @@
                   <w:color w:val="1155CC"/>
                   <w:u w:val="single"/>
                 </w:rPr>
-                <w:t>Democrats demand answers about conditions aboard USS Lincoln</w:t>
+                <w:t>China rattled by Trump White House chaos weeks ahead of Xi visit. It has happened before</w:t>
               </w:r>
             </w:hyperlink>
           </w:p>
@@ -5605,7 +5069,7 @@
               <w:rPr>
                 <w:sz w:val="17"/>
               </w:rPr>
-              <w:t>ABC News</w:t>
+              <w:t>South China Morning Post</w:t>
             </w:r>
           </w:p>
         </w:tc>
@@ -5618,6 +5082,7 @@
               <w:rPr>
                 <w:sz w:val="17"/>
               </w:rPr>
+              <w:t>sourcing depth</w:t>
             </w:r>
           </w:p>
         </w:tc>
@@ -5630,7 +5095,7 @@
               <w:rPr>
                 <w:sz w:val="17"/>
               </w:rPr>
-              <w:t>3</w:t>
+              <w:t>1</w:t>
             </w:r>
           </w:p>
         </w:tc>
@@ -5643,7 +5108,6 @@
               <w:rPr>
                 <w:sz w:val="17"/>
               </w:rPr>
-              <w:t>NBC News</w:t>
             </w:r>
           </w:p>
         </w:tc>
@@ -5686,7 +5150,7 @@
                   <w:color w:val="1155CC"/>
                   <w:u w:val="single"/>
                 </w:rPr>
-                <w:t>US Military Option for Cuba Fades as Trump Focuses on Sanctions</w:t>
+                <w:t>Pirro announces arrest in WWII Memorial vandalism</w:t>
               </w:r>
             </w:hyperlink>
           </w:p>
@@ -5700,7 +5164,7 @@
               <w:rPr>
                 <w:sz w:val="17"/>
               </w:rPr>
-              <w:t>Bloomberg</w:t>
+              <w:t>ABC News</w:t>
             </w:r>
           </w:p>
         </w:tc>
@@ -5713,7 +5177,6 @@
               <w:rPr>
                 <w:sz w:val="17"/>
               </w:rPr>
-              <w:t>sourcing depth</w:t>
             </w:r>
           </w:p>
         </w:tc>
@@ -5726,7 +5189,7 @@
               <w:rPr>
                 <w:sz w:val="17"/>
               </w:rPr>
-              <w:t>1</w:t>
+              <w:t>3</w:t>
             </w:r>
           </w:p>
         </w:tc>
@@ -5781,7 +5244,7 @@
                   <w:color w:val="1155CC"/>
                   <w:u w:val="single"/>
                 </w:rPr>
-                <w:t>DOJ, CFTC Investigating Iron Ore Trader Radiant World’s Deals</w:t>
+                <w:t>White House prepares to host crypto and prediction market execs</w:t>
               </w:r>
             </w:hyperlink>
           </w:p>
@@ -5795,7 +5258,7 @@
               <w:rPr>
                 <w:sz w:val="17"/>
               </w:rPr>
-              <w:t>Bloomberg</w:t>
+              <w:t>Semafor</w:t>
             </w:r>
           </w:p>
         </w:tc>
@@ -5861,7 +5324,7 @@
               <w:rPr>
                 <w:sz w:val="17"/>
               </w:rPr>
-              <w:t>4</w:t>
+              <w:t>3</w:t>
             </w:r>
           </w:p>
         </w:tc>
@@ -5876,7 +5339,7 @@
                   <w:color w:val="1155CC"/>
                   <w:u w:val="single"/>
                 </w:rPr>
-                <w:t>Podcast: „Auf den Punkt“: Hitzewelle: Das würde den Landwirten jetzt helfen</w:t>
+                <w:t>Berkshire Hathaway boosts Alphabet to a top three holding, ups Delta and housing bets</w:t>
               </w:r>
             </w:hyperlink>
           </w:p>
@@ -5890,7 +5353,7 @@
               <w:rPr>
                 <w:sz w:val="17"/>
               </w:rPr>
-              <w:t>Sueddeutsche Zeitung</w:t>
+              <w:t>CNBC</w:t>
             </w:r>
           </w:p>
         </w:tc>
@@ -5903,6 +5366,7 @@
               <w:rPr>
                 <w:sz w:val="17"/>
               </w:rPr>
+              <w:t>primary source</w:t>
             </w:r>
           </w:p>
         </w:tc>
@@ -5915,7 +5379,7 @@
               <w:rPr>
                 <w:sz w:val="17"/>
               </w:rPr>
-              <w:t>3</w:t>
+              <w:t>1</w:t>
             </w:r>
           </w:p>
         </w:tc>
@@ -5955,7 +5419,7 @@
               <w:rPr>
                 <w:sz w:val="17"/>
               </w:rPr>
-              <w:t>8</w:t>
+              <w:t>2</w:t>
             </w:r>
           </w:p>
         </w:tc>
@@ -5970,7 +5434,7 @@
                   <w:color w:val="1155CC"/>
                   <w:u w:val="single"/>
                 </w:rPr>
-                <w:t>Kyrsten Sinema Tells Lawyers For Boyfriend's Ex-Wife About First Time They Had Sex</w:t>
+                <w:t>BBC seeks to subpoena Trump children and son-in-law over defamation lawsuit</w:t>
               </w:r>
             </w:hyperlink>
           </w:p>
@@ -5984,7 +5448,7 @@
               <w:rPr>
                 <w:sz w:val="17"/>
               </w:rPr>
-              <w:t>TMZ</w:t>
+              <w:t>The Guardian US</w:t>
             </w:r>
           </w:p>
         </w:tc>
@@ -5997,7 +5461,7 @@
               <w:rPr>
                 <w:sz w:val="17"/>
               </w:rPr>
-              <w:t>exclusivity, sourcing depth</w:t>
+              <w:t>primary source</w:t>
             </w:r>
           </w:p>
         </w:tc>
@@ -6023,6 +5487,7 @@
               <w:rPr>
                 <w:sz w:val="17"/>
               </w:rPr>
+              <w:t>Deadline, The Hill, BBC News</w:t>
             </w:r>
           </w:p>
         </w:tc>
@@ -6050,7 +5515,7 @@
               <w:rPr>
                 <w:sz w:val="17"/>
               </w:rPr>
-              <w:t>6</w:t>
+              <w:t>2</w:t>
             </w:r>
           </w:p>
         </w:tc>
@@ -6065,7 +5530,7 @@
                   <w:color w:val="1155CC"/>
                   <w:u w:val="single"/>
                 </w:rPr>
-                <w:t>Luigi Mangione expected to plead guilty in US CEO killing</w:t>
+                <w:t>Dad of USS Lincoln sailor worries about crew as deployment stretches on</w:t>
               </w:r>
             </w:hyperlink>
           </w:p>
@@ -6079,7 +5544,7 @@
               <w:rPr>
                 <w:sz w:val="17"/>
               </w:rPr>
-              <w:t>South China Morning Post</w:t>
+              <w:t>CBS News</w:t>
             </w:r>
           </w:p>
         </w:tc>
@@ -6092,7 +5557,6 @@
               <w:rPr>
                 <w:sz w:val="17"/>
               </w:rPr>
-              <w:t>sourcing depth</w:t>
             </w:r>
           </w:p>
         </w:tc>
@@ -6105,7 +5569,7 @@
               <w:rPr>
                 <w:sz w:val="17"/>
               </w:rPr>
-              <w:t>1</w:t>
+              <w:t>2</w:t>
             </w:r>
           </w:p>
         </w:tc>
@@ -6118,7 +5582,7 @@
               <w:rPr>
                 <w:sz w:val="17"/>
               </w:rPr>
-              <w:t>NBC News, TMZ, BBC News, Business Insider, TMZ +2 more</w:t>
+              <w:t>ABC News, Los Angeles Times, The Guardian US</w:t>
             </w:r>
           </w:p>
         </w:tc>
@@ -6146,7 +5610,7 @@
               <w:rPr>
                 <w:sz w:val="17"/>
               </w:rPr>
-              <w:t>6</w:t>
+              <w:t>2</w:t>
             </w:r>
           </w:p>
         </w:tc>
@@ -6161,7 +5625,7 @@
                   <w:color w:val="1155CC"/>
                   <w:u w:val="single"/>
                 </w:rPr>
-                <w:t>Author Correction: Cell intrinsic immunity spreads to bystander cells via the intercellular transfer of cGAMP</w:t>
+                <w:t>CBS News correspondent Matt Gutman accused of harassment in wrongful termination suit against ABC</w:t>
               </w:r>
             </w:hyperlink>
           </w:p>
@@ -6175,7 +5639,7 @@
               <w:rPr>
                 <w:sz w:val="17"/>
               </w:rPr>
-              <w:t>Nature News</w:t>
+              <w:t>Los Angeles Times</w:t>
             </w:r>
           </w:p>
         </w:tc>
@@ -6188,6 +5652,7 @@
               <w:rPr>
                 <w:sz w:val="17"/>
               </w:rPr>
+              <w:t>primary source</w:t>
             </w:r>
           </w:p>
         </w:tc>
@@ -6200,7 +5665,7 @@
               <w:rPr>
                 <w:sz w:val="17"/>
               </w:rPr>
-              <w:t>7</w:t>
+              <w:t>1</w:t>
             </w:r>
           </w:p>
         </w:tc>
@@ -6213,7 +5678,7 @@
               <w:rPr>
                 <w:sz w:val="17"/>
               </w:rPr>
-              <w:t>Nature News, Nature News</w:t>
+              <w:t>Page Six, TMZ, Variety</w:t>
             </w:r>
           </w:p>
         </w:tc>
@@ -6241,7 +5706,7 @@
               <w:rPr>
                 <w:sz w:val="17"/>
               </w:rPr>
-              <w:t>6</w:t>
+              <w:t>2</w:t>
             </w:r>
           </w:p>
         </w:tc>
@@ -6256,7 +5721,7 @@
                   <w:color w:val="1155CC"/>
                   <w:u w:val="single"/>
                 </w:rPr>
-                <w:t>Anthropic’s ‘First Lady’ Took a Winding Road to the Top</w:t>
+                <w:t>Peter James returns to Sussex with his 57 animals</w:t>
               </w:r>
             </w:hyperlink>
           </w:p>
@@ -6270,7 +5735,7 @@
               <w:rPr>
                 <w:sz w:val="17"/>
               </w:rPr>
-              <w:t>The Information</w:t>
+              <w:t>BBC News</w:t>
             </w:r>
           </w:p>
         </w:tc>
@@ -6295,7 +5760,7 @@
               <w:rPr>
                 <w:sz w:val="17"/>
               </w:rPr>
-              <w:t>4</w:t>
+              <w:t>2</w:t>
             </w:r>
           </w:p>
         </w:tc>
@@ -6335,7 +5800,7 @@
               <w:rPr>
                 <w:sz w:val="17"/>
               </w:rPr>
-              <w:t>6</w:t>
+              <w:t>2</w:t>
             </w:r>
           </w:p>
         </w:tc>
@@ -6350,7 +5815,7 @@
                   <w:color w:val="1155CC"/>
                   <w:u w:val="single"/>
                 </w:rPr>
-                <w:t>Mark Zuckerberg’s AI Manifesto Is 6,500 Words—and Barely Says Anything</w:t>
+                <w:t>Justice Department expands military's power to detain migrants near border</w:t>
               </w:r>
             </w:hyperlink>
           </w:p>
@@ -6364,7 +5829,7 @@
               <w:rPr>
                 <w:sz w:val="17"/>
               </w:rPr>
-              <w:t>Wired</w:t>
+              <w:t>CBS News</w:t>
             </w:r>
           </w:p>
         </w:tc>
@@ -6389,7 +5854,7 @@
               <w:rPr>
                 <w:sz w:val="17"/>
               </w:rPr>
-              <w:t>4</w:t>
+              <w:t>2</w:t>
             </w:r>
           </w:p>
         </w:tc>
@@ -6429,7 +5894,7 @@
               <w:rPr>
                 <w:sz w:val="17"/>
               </w:rPr>
-              <w:t>4</w:t>
+              <w:t>2</w:t>
             </w:r>
           </w:p>
         </w:tc>
@@ -6444,7 +5909,7 @@
                   <w:color w:val="1155CC"/>
                   <w:u w:val="single"/>
                 </w:rPr>
-                <w:t>Scoop: Trump team tells GOP to lean in on health care</w:t>
+                <w:t>David Ellison’s Friday ParaBros News Dump: CEO Complains About “Needless Costs” Of State AGs’ Antitrust Suit As Mexico Approves Merger</w:t>
               </w:r>
             </w:hyperlink>
           </w:p>
@@ -6458,7 +5923,7 @@
               <w:rPr>
                 <w:sz w:val="17"/>
               </w:rPr>
-              <w:t>Axios</w:t>
+              <w:t>Deadline</w:t>
             </w:r>
           </w:p>
         </w:tc>
@@ -6471,7 +5936,7 @@
               <w:rPr>
                 <w:sz w:val="17"/>
               </w:rPr>
-              <w:t>exclusivity, headline label</w:t>
+              <w:t>primary source</w:t>
             </w:r>
           </w:p>
         </w:tc>
@@ -6524,7 +5989,7 @@
               <w:rPr>
                 <w:sz w:val="17"/>
               </w:rPr>
-              <w:t>4</w:t>
+              <w:t>2</w:t>
             </w:r>
           </w:p>
         </w:tc>
@@ -6539,7 +6004,7 @@
                   <w:color w:val="1155CC"/>
                   <w:u w:val="single"/>
                 </w:rPr>
-                <w:t>Live: 'A rat's nest of conflicts': Senator's scathing assessment of KPMG saga</w:t>
+                <w:t>RHOBH's Dorit Kemsley Shuts Down Ex PK's Emergency Effort To Sell L.A. Home</w:t>
               </w:r>
             </w:hyperlink>
           </w:p>
@@ -6553,7 +6018,7 @@
               <w:rPr>
                 <w:sz w:val="17"/>
               </w:rPr>
-              <w:t>ABC Australia</w:t>
+              <w:t>TMZ</w:t>
             </w:r>
           </w:p>
         </w:tc>
@@ -6566,7 +6031,7 @@
               <w:rPr>
                 <w:sz w:val="17"/>
               </w:rPr>
-              <w:t>primary source</w:t>
+              <w:t>exclusivity</w:t>
             </w:r>
           </w:p>
         </w:tc>
@@ -6619,7 +6084,7 @@
               <w:rPr>
                 <w:sz w:val="17"/>
               </w:rPr>
-              <w:t>4</w:t>
+              <w:t>2</w:t>
             </w:r>
           </w:p>
         </w:tc>
@@ -6634,7 +6099,7 @@
                   <w:color w:val="1155CC"/>
                   <w:u w:val="single"/>
                 </w:rPr>
-                <w:t>Alex Cooper's Unwell Beverage Business Is Shutting Down</w:t>
+                <w:t>Jax Taylor and Publicist Lori Krebs Step Out for Dinner Date in L.A.</w:t>
               </w:r>
             </w:hyperlink>
           </w:p>
@@ -6661,7 +6126,7 @@
               <w:rPr>
                 <w:sz w:val="17"/>
               </w:rPr>
-              <w:t>sourcing depth</w:t>
+              <w:t>exclusivity</w:t>
             </w:r>
           </w:p>
         </w:tc>
@@ -6714,7 +6179,7 @@
               <w:rPr>
                 <w:sz w:val="17"/>
               </w:rPr>
-              <w:t>4</w:t>
+              <w:t>2</w:t>
             </w:r>
           </w:p>
         </w:tc>
@@ -6729,7 +6194,7 @@
                   <w:color w:val="1155CC"/>
                   <w:u w:val="single"/>
                 </w:rPr>
-                <w:t>Aerosmith Steven Tyler’s Accuser Fighting to Keep Abortion Evidence Out of Court</w:t>
+                <w:t>Perez Hilton Treated for Overdose After Alarming Live Stream</w:t>
               </w:r>
             </w:hyperlink>
           </w:p>
@@ -6809,7 +6274,7 @@
               <w:rPr>
                 <w:sz w:val="17"/>
               </w:rPr>
-              <w:t>4</w:t>
+              <w:t>2</w:t>
             </w:r>
           </w:p>
         </w:tc>
@@ -6824,7 +6289,7 @@
                   <w:color w:val="1155CC"/>
                   <w:u w:val="single"/>
                 </w:rPr>
-                <w:t>Judge dismisses suit over alleged Harvard antisemitism. What it could mean for UC cases</w:t>
+                <w:t>'An absolute joke': Voters count the cost of bizarre Binface vs Farage battle</w:t>
               </w:r>
             </w:hyperlink>
           </w:p>
@@ -6838,7 +6303,7 @@
               <w:rPr>
                 <w:sz w:val="17"/>
               </w:rPr>
-              <w:t>Los Angeles Times</w:t>
+              <w:t>ABC Australia</w:t>
             </w:r>
           </w:p>
         </w:tc>
@@ -6851,7 +6316,6 @@
               <w:rPr>
                 <w:sz w:val="17"/>
               </w:rPr>
-              <w:t>primary source</w:t>
             </w:r>
           </w:p>
         </w:tc>
@@ -6877,7 +6341,6 @@
               <w:rPr>
                 <w:sz w:val="17"/>
               </w:rPr>
-              <w:t>NPR</w:t>
             </w:r>
           </w:p>
         </w:tc>
@@ -6905,7 +6368,7 @@
               <w:rPr>
                 <w:sz w:val="17"/>
               </w:rPr>
-              <w:t>4</w:t>
+              <w:t>2</w:t>
             </w:r>
           </w:p>
         </w:tc>
@@ -6920,7 +6383,7 @@
                   <w:color w:val="1155CC"/>
                   <w:u w:val="single"/>
                 </w:rPr>
-                <w:t>Iran war live: US eyes indefinite Iran naval blockade</w:t>
+                <w:t>Renée Zellweger Crafts Pottery With Boyfriend Ant Anstead at Art Festival</w:t>
               </w:r>
             </w:hyperlink>
           </w:p>
@@ -6934,7 +6397,7 @@
               <w:rPr>
                 <w:sz w:val="17"/>
               </w:rPr>
-              <w:t>Al Jazeera English</w:t>
+              <w:t>TMZ</w:t>
             </w:r>
           </w:p>
         </w:tc>
@@ -6947,6 +6410,7 @@
               <w:rPr>
                 <w:sz w:val="17"/>
               </w:rPr>
+              <w:t>primary source</w:t>
             </w:r>
           </w:p>
         </w:tc>
@@ -6959,7 +6423,7 @@
               <w:rPr>
                 <w:sz w:val="17"/>
               </w:rPr>
-              <w:t>3</w:t>
+              <w:t>1</w:t>
             </w:r>
           </w:p>
         </w:tc>
@@ -6999,7 +6463,7 @@
               <w:rPr>
                 <w:sz w:val="17"/>
               </w:rPr>
-              <w:t>4</w:t>
+              <w:t>2</w:t>
             </w:r>
           </w:p>
         </w:tc>
@@ -7014,7 +6478,7 @@
                   <w:color w:val="1155CC"/>
                   <w:u w:val="single"/>
                 </w:rPr>
-                <w:t>Two seriously hurt as passenger train derails in East Sussex</w:t>
+                <w:t>Kumanjayi Little Baby to be remembered at funeral service  today</w:t>
               </w:r>
             </w:hyperlink>
           </w:p>
@@ -7028,7 +6492,7 @@
               <w:rPr>
                 <w:sz w:val="17"/>
               </w:rPr>
-              <w:t>BBC News</w:t>
+              <w:t>ABC Australia</w:t>
             </w:r>
           </w:p>
         </w:tc>
@@ -7053,7 +6517,7 @@
               <w:rPr>
                 <w:sz w:val="17"/>
               </w:rPr>
-              <w:t>3</w:t>
+              <w:t>2</w:t>
             </w:r>
           </w:p>
         </w:tc>
@@ -7093,7 +6557,7 @@
               <w:rPr>
                 <w:sz w:val="17"/>
               </w:rPr>
-              <w:t>4</w:t>
+              <w:t>2</w:t>
             </w:r>
           </w:p>
         </w:tc>
@@ -7108,7 +6572,7 @@
                   <w:color w:val="1155CC"/>
                   <w:u w:val="single"/>
                 </w:rPr>
-                <w:t>Appeals court rules key Alien Enemies Act lawsuit moot</w:t>
+                <w:t>Skinks facing extinction find new hope away from predatory snakes</w:t>
               </w:r>
             </w:hyperlink>
           </w:p>
@@ -7122,7 +6586,7 @@
               <w:rPr>
                 <w:sz w:val="17"/>
               </w:rPr>
-              <w:t>The Hill</w:t>
+              <w:t>ABC Australia</w:t>
             </w:r>
           </w:p>
         </w:tc>
@@ -7135,7 +6599,6 @@
               <w:rPr>
                 <w:sz w:val="17"/>
               </w:rPr>
-              <w:t>primary source</w:t>
             </w:r>
           </w:p>
         </w:tc>
@@ -7149,668 +6612,6 @@
                 <w:sz w:val="17"/>
               </w:rPr>
               <w:t>2</w:t>
-            </w:r>
-          </w:p>
-        </w:tc>
-        <w:tc>
-          <w:tcPr>
-            <w:tcW w:type="dxa" w:w="3168"/>
-          </w:tcPr>
-          <w:p>
-            <w:r>
-              <w:rPr>
-                <w:sz w:val="17"/>
-              </w:rPr>
-            </w:r>
-          </w:p>
-        </w:tc>
-      </w:tr>
-      <w:tr>
-        <w:tc>
-          <w:tcPr>
-            <w:tcW w:type="dxa" w:w="576"/>
-          </w:tcPr>
-          <w:p>
-            <w:r>
-              <w:rPr>
-                <w:sz w:val="17"/>
-              </w:rPr>
-              <w:t>51</w:t>
-            </w:r>
-          </w:p>
-        </w:tc>
-        <w:tc>
-          <w:tcPr>
-            <w:tcW w:type="dxa" w:w="864"/>
-          </w:tcPr>
-          <w:p>
-            <w:r>
-              <w:rPr>
-                <w:sz w:val="17"/>
-              </w:rPr>
-              <w:t>3</w:t>
-            </w:r>
-          </w:p>
-        </w:tc>
-        <w:tc>
-          <w:tcPr>
-            <w:tcW w:type="dxa" w:w="5184"/>
-          </w:tcPr>
-          <w:p>
-            <w:hyperlink r:id="rId59">
-              <w:r>
-                <w:rPr>
-                  <w:color w:val="1155CC"/>
-                  <w:u w:val="single"/>
-                </w:rPr>
-                <w:t>Alleged Tupac Shakur Killer Isn't 'Nervous' About Going to Prison for Life</w:t>
-              </w:r>
-            </w:hyperlink>
-          </w:p>
-        </w:tc>
-        <w:tc>
-          <w:tcPr>
-            <w:tcW w:type="dxa" w:w="1872"/>
-          </w:tcPr>
-          <w:p>
-            <w:r>
-              <w:rPr>
-                <w:sz w:val="17"/>
-              </w:rPr>
-              <w:t>TMZ</w:t>
-            </w:r>
-          </w:p>
-        </w:tc>
-        <w:tc>
-          <w:tcPr>
-            <w:tcW w:type="dxa" w:w="2304"/>
-          </w:tcPr>
-          <w:p>
-            <w:r>
-              <w:rPr>
-                <w:sz w:val="17"/>
-              </w:rPr>
-              <w:t>sourcing depth</w:t>
-            </w:r>
-          </w:p>
-        </w:tc>
-        <w:tc>
-          <w:tcPr>
-            <w:tcW w:type="dxa" w:w="1008"/>
-          </w:tcPr>
-          <w:p>
-            <w:r>
-              <w:rPr>
-                <w:sz w:val="17"/>
-              </w:rPr>
-              <w:t>1</w:t>
-            </w:r>
-          </w:p>
-        </w:tc>
-        <w:tc>
-          <w:tcPr>
-            <w:tcW w:type="dxa" w:w="3168"/>
-          </w:tcPr>
-          <w:p>
-            <w:r>
-              <w:rPr>
-                <w:sz w:val="17"/>
-              </w:rPr>
-            </w:r>
-          </w:p>
-        </w:tc>
-      </w:tr>
-      <w:tr>
-        <w:tc>
-          <w:tcPr>
-            <w:tcW w:type="dxa" w:w="576"/>
-          </w:tcPr>
-          <w:p>
-            <w:r>
-              <w:rPr>
-                <w:sz w:val="17"/>
-              </w:rPr>
-              <w:t>52</w:t>
-            </w:r>
-          </w:p>
-        </w:tc>
-        <w:tc>
-          <w:tcPr>
-            <w:tcW w:type="dxa" w:w="864"/>
-          </w:tcPr>
-          <w:p>
-            <w:r>
-              <w:rPr>
-                <w:sz w:val="17"/>
-              </w:rPr>
-              <w:t>2</w:t>
-            </w:r>
-          </w:p>
-        </w:tc>
-        <w:tc>
-          <w:tcPr>
-            <w:tcW w:type="dxa" w:w="5184"/>
-          </w:tcPr>
-          <w:p>
-            <w:hyperlink r:id="rId60">
-              <w:r>
-                <w:rPr>
-                  <w:color w:val="1155CC"/>
-                  <w:u w:val="single"/>
-                </w:rPr>
-                <w:t>Feds tell provinces to get ready to put American booze back on the shelves: sources</w:t>
-              </w:r>
-            </w:hyperlink>
-          </w:p>
-        </w:tc>
-        <w:tc>
-          <w:tcPr>
-            <w:tcW w:type="dxa" w:w="1872"/>
-          </w:tcPr>
-          <w:p>
-            <w:r>
-              <w:rPr>
-                <w:sz w:val="17"/>
-              </w:rPr>
-              <w:t>CBC News</w:t>
-            </w:r>
-          </w:p>
-        </w:tc>
-        <w:tc>
-          <w:tcPr>
-            <w:tcW w:type="dxa" w:w="2304"/>
-          </w:tcPr>
-          <w:p>
-            <w:r>
-              <w:rPr>
-                <w:sz w:val="17"/>
-              </w:rPr>
-            </w:r>
-          </w:p>
-        </w:tc>
-        <w:tc>
-          <w:tcPr>
-            <w:tcW w:type="dxa" w:w="1008"/>
-          </w:tcPr>
-          <w:p>
-            <w:r>
-              <w:rPr>
-                <w:sz w:val="17"/>
-              </w:rPr>
-              <w:t>2</w:t>
-            </w:r>
-          </w:p>
-        </w:tc>
-        <w:tc>
-          <w:tcPr>
-            <w:tcW w:type="dxa" w:w="3168"/>
-          </w:tcPr>
-          <w:p>
-            <w:r>
-              <w:rPr>
-                <w:sz w:val="17"/>
-              </w:rPr>
-            </w:r>
-          </w:p>
-        </w:tc>
-      </w:tr>
-      <w:tr>
-        <w:tc>
-          <w:tcPr>
-            <w:tcW w:type="dxa" w:w="576"/>
-          </w:tcPr>
-          <w:p>
-            <w:r>
-              <w:rPr>
-                <w:sz w:val="17"/>
-              </w:rPr>
-              <w:t>53</w:t>
-            </w:r>
-          </w:p>
-        </w:tc>
-        <w:tc>
-          <w:tcPr>
-            <w:tcW w:type="dxa" w:w="864"/>
-          </w:tcPr>
-          <w:p>
-            <w:r>
-              <w:rPr>
-                <w:sz w:val="17"/>
-              </w:rPr>
-              <w:t>2</w:t>
-            </w:r>
-          </w:p>
-        </w:tc>
-        <w:tc>
-          <w:tcPr>
-            <w:tcW w:type="dxa" w:w="5184"/>
-          </w:tcPr>
-          <w:p>
-            <w:hyperlink r:id="rId61">
-              <w:r>
-                <w:rPr>
-                  <w:color w:val="1155CC"/>
-                  <w:u w:val="single"/>
-                </w:rPr>
-                <w:t>We tested the Brick. Did it free us from mindless scrolling?</w:t>
-              </w:r>
-            </w:hyperlink>
-          </w:p>
-        </w:tc>
-        <w:tc>
-          <w:tcPr>
-            <w:tcW w:type="dxa" w:w="1872"/>
-          </w:tcPr>
-          <w:p>
-            <w:r>
-              <w:rPr>
-                <w:sz w:val="17"/>
-              </w:rPr>
-              <w:t>NBC News</w:t>
-            </w:r>
-          </w:p>
-        </w:tc>
-        <w:tc>
-          <w:tcPr>
-            <w:tcW w:type="dxa" w:w="2304"/>
-          </w:tcPr>
-          <w:p>
-            <w:r>
-              <w:rPr>
-                <w:sz w:val="17"/>
-              </w:rPr>
-            </w:r>
-          </w:p>
-        </w:tc>
-        <w:tc>
-          <w:tcPr>
-            <w:tcW w:type="dxa" w:w="1008"/>
-          </w:tcPr>
-          <w:p>
-            <w:r>
-              <w:rPr>
-                <w:sz w:val="17"/>
-              </w:rPr>
-              <w:t>2</w:t>
-            </w:r>
-          </w:p>
-        </w:tc>
-        <w:tc>
-          <w:tcPr>
-            <w:tcW w:type="dxa" w:w="3168"/>
-          </w:tcPr>
-          <w:p>
-            <w:r>
-              <w:rPr>
-                <w:sz w:val="17"/>
-              </w:rPr>
-            </w:r>
-          </w:p>
-        </w:tc>
-      </w:tr>
-      <w:tr>
-        <w:tc>
-          <w:tcPr>
-            <w:tcW w:type="dxa" w:w="576"/>
-          </w:tcPr>
-          <w:p>
-            <w:r>
-              <w:rPr>
-                <w:sz w:val="17"/>
-              </w:rPr>
-              <w:t>54</w:t>
-            </w:r>
-          </w:p>
-        </w:tc>
-        <w:tc>
-          <w:tcPr>
-            <w:tcW w:type="dxa" w:w="864"/>
-          </w:tcPr>
-          <w:p>
-            <w:r>
-              <w:rPr>
-                <w:sz w:val="17"/>
-              </w:rPr>
-              <w:t>2</w:t>
-            </w:r>
-          </w:p>
-        </w:tc>
-        <w:tc>
-          <w:tcPr>
-            <w:tcW w:type="dxa" w:w="5184"/>
-          </w:tcPr>
-          <w:p>
-            <w:hyperlink r:id="rId62">
-              <w:r>
-                <w:rPr>
-                  <w:color w:val="1155CC"/>
-                  <w:u w:val="single"/>
-                </w:rPr>
-                <w:t>Teamsters Pound Paramount Over WBD Merger Promises &amp; Threats: “Stop Playing Games”</w:t>
-              </w:r>
-            </w:hyperlink>
-          </w:p>
-        </w:tc>
-        <w:tc>
-          <w:tcPr>
-            <w:tcW w:type="dxa" w:w="1872"/>
-          </w:tcPr>
-          <w:p>
-            <w:r>
-              <w:rPr>
-                <w:sz w:val="17"/>
-              </w:rPr>
-              <w:t>Deadline</w:t>
-            </w:r>
-          </w:p>
-        </w:tc>
-        <w:tc>
-          <w:tcPr>
-            <w:tcW w:type="dxa" w:w="2304"/>
-          </w:tcPr>
-          <w:p>
-            <w:r>
-              <w:rPr>
-                <w:sz w:val="17"/>
-              </w:rPr>
-              <w:t>primary source</w:t>
-            </w:r>
-          </w:p>
-        </w:tc>
-        <w:tc>
-          <w:tcPr>
-            <w:tcW w:type="dxa" w:w="1008"/>
-          </w:tcPr>
-          <w:p>
-            <w:r>
-              <w:rPr>
-                <w:sz w:val="17"/>
-              </w:rPr>
-              <w:t>1</w:t>
-            </w:r>
-          </w:p>
-        </w:tc>
-        <w:tc>
-          <w:tcPr>
-            <w:tcW w:type="dxa" w:w="3168"/>
-          </w:tcPr>
-          <w:p>
-            <w:r>
-              <w:rPr>
-                <w:sz w:val="17"/>
-              </w:rPr>
-            </w:r>
-          </w:p>
-        </w:tc>
-      </w:tr>
-      <w:tr>
-        <w:tc>
-          <w:tcPr>
-            <w:tcW w:type="dxa" w:w="576"/>
-          </w:tcPr>
-          <w:p>
-            <w:r>
-              <w:rPr>
-                <w:sz w:val="17"/>
-              </w:rPr>
-              <w:t>55</w:t>
-            </w:r>
-          </w:p>
-        </w:tc>
-        <w:tc>
-          <w:tcPr>
-            <w:tcW w:type="dxa" w:w="864"/>
-          </w:tcPr>
-          <w:p>
-            <w:r>
-              <w:rPr>
-                <w:sz w:val="17"/>
-              </w:rPr>
-              <w:t>2</w:t>
-            </w:r>
-          </w:p>
-        </w:tc>
-        <w:tc>
-          <w:tcPr>
-            <w:tcW w:type="dxa" w:w="5184"/>
-          </w:tcPr>
-          <w:p>
-            <w:hyperlink r:id="rId63">
-              <w:r>
-                <w:rPr>
-                  <w:color w:val="1155CC"/>
-                  <w:u w:val="single"/>
-                </w:rPr>
-                <w:t>Perez Hilton’s sister gives update on celeb blogger’s injuries after suicide attempt, details his ‘long road’ to recovery</w:t>
-              </w:r>
-            </w:hyperlink>
-          </w:p>
-        </w:tc>
-        <w:tc>
-          <w:tcPr>
-            <w:tcW w:type="dxa" w:w="1872"/>
-          </w:tcPr>
-          <w:p>
-            <w:r>
-              <w:rPr>
-                <w:sz w:val="17"/>
-              </w:rPr>
-              <w:t>Page Six</w:t>
-            </w:r>
-          </w:p>
-        </w:tc>
-        <w:tc>
-          <w:tcPr>
-            <w:tcW w:type="dxa" w:w="2304"/>
-          </w:tcPr>
-          <w:p>
-            <w:r>
-              <w:rPr>
-                <w:sz w:val="17"/>
-              </w:rPr>
-            </w:r>
-          </w:p>
-        </w:tc>
-        <w:tc>
-          <w:tcPr>
-            <w:tcW w:type="dxa" w:w="1008"/>
-          </w:tcPr>
-          <w:p>
-            <w:r>
-              <w:rPr>
-                <w:sz w:val="17"/>
-              </w:rPr>
-              <w:t>2</w:t>
-            </w:r>
-          </w:p>
-        </w:tc>
-        <w:tc>
-          <w:tcPr>
-            <w:tcW w:type="dxa" w:w="3168"/>
-          </w:tcPr>
-          <w:p>
-            <w:r>
-              <w:rPr>
-                <w:sz w:val="17"/>
-              </w:rPr>
-            </w:r>
-          </w:p>
-        </w:tc>
-      </w:tr>
-      <w:tr>
-        <w:tc>
-          <w:tcPr>
-            <w:tcW w:type="dxa" w:w="576"/>
-          </w:tcPr>
-          <w:p>
-            <w:r>
-              <w:rPr>
-                <w:sz w:val="17"/>
-              </w:rPr>
-              <w:t>56</w:t>
-            </w:r>
-          </w:p>
-        </w:tc>
-        <w:tc>
-          <w:tcPr>
-            <w:tcW w:type="dxa" w:w="864"/>
-          </w:tcPr>
-          <w:p>
-            <w:r>
-              <w:rPr>
-                <w:sz w:val="17"/>
-              </w:rPr>
-              <w:t>2</w:t>
-            </w:r>
-          </w:p>
-        </w:tc>
-        <w:tc>
-          <w:tcPr>
-            <w:tcW w:type="dxa" w:w="5184"/>
-          </w:tcPr>
-          <w:p>
-            <w:hyperlink r:id="rId64">
-              <w:r>
-                <w:rPr>
-                  <w:color w:val="1155CC"/>
-                  <w:u w:val="single"/>
-                </w:rPr>
-                <w:t>Malcolm-Jamal Warner's Mom Reaches Settlement With His Daughter's Guardians Over Money</w:t>
-              </w:r>
-            </w:hyperlink>
-          </w:p>
-        </w:tc>
-        <w:tc>
-          <w:tcPr>
-            <w:tcW w:type="dxa" w:w="1872"/>
-          </w:tcPr>
-          <w:p>
-            <w:r>
-              <w:rPr>
-                <w:sz w:val="17"/>
-              </w:rPr>
-              <w:t>TMZ</w:t>
-            </w:r>
-          </w:p>
-        </w:tc>
-        <w:tc>
-          <w:tcPr>
-            <w:tcW w:type="dxa" w:w="2304"/>
-          </w:tcPr>
-          <w:p>
-            <w:r>
-              <w:rPr>
-                <w:sz w:val="17"/>
-              </w:rPr>
-              <w:t>exclusivity</w:t>
-            </w:r>
-          </w:p>
-        </w:tc>
-        <w:tc>
-          <w:tcPr>
-            <w:tcW w:type="dxa" w:w="1008"/>
-          </w:tcPr>
-          <w:p>
-            <w:r>
-              <w:rPr>
-                <w:sz w:val="17"/>
-              </w:rPr>
-              <w:t>1</w:t>
-            </w:r>
-          </w:p>
-        </w:tc>
-        <w:tc>
-          <w:tcPr>
-            <w:tcW w:type="dxa" w:w="3168"/>
-          </w:tcPr>
-          <w:p>
-            <w:r>
-              <w:rPr>
-                <w:sz w:val="17"/>
-              </w:rPr>
-            </w:r>
-          </w:p>
-        </w:tc>
-      </w:tr>
-      <w:tr>
-        <w:tc>
-          <w:tcPr>
-            <w:tcW w:type="dxa" w:w="576"/>
-          </w:tcPr>
-          <w:p>
-            <w:r>
-              <w:rPr>
-                <w:sz w:val="17"/>
-              </w:rPr>
-              <w:t>57</w:t>
-            </w:r>
-          </w:p>
-        </w:tc>
-        <w:tc>
-          <w:tcPr>
-            <w:tcW w:type="dxa" w:w="864"/>
-          </w:tcPr>
-          <w:p>
-            <w:r>
-              <w:rPr>
-                <w:sz w:val="17"/>
-              </w:rPr>
-              <w:t>2</w:t>
-            </w:r>
-          </w:p>
-        </w:tc>
-        <w:tc>
-          <w:tcPr>
-            <w:tcW w:type="dxa" w:w="5184"/>
-          </w:tcPr>
-          <w:p>
-            <w:hyperlink r:id="rId65">
-              <w:r>
-                <w:rPr>
-                  <w:color w:val="1155CC"/>
-                  <w:u w:val="single"/>
-                </w:rPr>
-                <w:t>Lindsay Clancy Toxicology Detected Four Medications, Read the Report</w:t>
-              </w:r>
-            </w:hyperlink>
-          </w:p>
-        </w:tc>
-        <w:tc>
-          <w:tcPr>
-            <w:tcW w:type="dxa" w:w="1872"/>
-          </w:tcPr>
-          <w:p>
-            <w:r>
-              <w:rPr>
-                <w:sz w:val="17"/>
-              </w:rPr>
-              <w:t>TMZ</w:t>
-            </w:r>
-          </w:p>
-        </w:tc>
-        <w:tc>
-          <w:tcPr>
-            <w:tcW w:type="dxa" w:w="2304"/>
-          </w:tcPr>
-          <w:p>
-            <w:r>
-              <w:rPr>
-                <w:sz w:val="17"/>
-              </w:rPr>
-              <w:t>exclusivity</w:t>
-            </w:r>
-          </w:p>
-        </w:tc>
-        <w:tc>
-          <w:tcPr>
-            <w:tcW w:type="dxa" w:w="1008"/>
-          </w:tcPr>
-          <w:p>
-            <w:r>
-              <w:rPr>
-                <w:sz w:val="17"/>
-              </w:rPr>
-              <w:t>1</w:t>
             </w:r>
           </w:p>
         </w:tc>
@@ -7841,7 +6642,7 @@
         <w:pStyle w:val="ListBullet"/>
       </w:pPr>
       <w:r>
-        <w:t>https://www.abc.net.au/news/2026-08-15/trumps-reflecting-pool-mess-all-captured-on-webcam/106941676</w:t>
+        <w:t>https://www.nbcnews.com/news/us-news/13-year-old-survivor-michigan-rampage-called-911-rcna592709</w:t>
       </w:r>
     </w:p>
     <w:p>
@@ -7849,7 +6650,7 @@
         <w:pStyle w:val="ListBullet"/>
       </w:pPr>
       <w:r>
-        <w:t>https://www.tmz.com/2026/08/14/mckenna-west-threatened-with-fine-for-refusing-abortion/</w:t>
+        <w:t>https://variety.com/2026/tv/news/selena-gomez-slams-wondermind-lawsuit-file-to-dismiss-1236835495/</w:t>
       </w:r>
     </w:p>
     <w:p>
@@ -7857,7 +6658,7 @@
         <w:pStyle w:val="ListBullet"/>
       </w:pPr>
       <w:r>
-        <w:t>https://www.cnbc.com/2026/08/14/prediction-markets-scrutiny-mounts-from-regulators-and-banks.html</w:t>
+        <w:t>https://deadline.com/2026/08/kylo-ren-hunt-for-ben-solo-dave-filoni-adam-driver-d23-1237041672/</w:t>
       </w:r>
     </w:p>
     <w:p>
@@ -7865,7 +6666,7 @@
         <w:pStyle w:val="ListBullet"/>
       </w:pPr>
       <w:r>
-        <w:t>https://pagesix.com/2026/08/14/celebrity-news/bethenny-frankel-responds-to-cafe-criticism-from-influencers/</w:t>
+        <w:t>https://www.tmz.com/2026/08/15/selena-gomez-denies-fraud-accusations/</w:t>
       </w:r>
     </w:p>
     <w:p>
@@ -7873,7 +6674,7 @@
         <w:pStyle w:val="ListBullet"/>
       </w:pPr>
       <w:r>
-        <w:t>https://deadline.com/2026/08/spider-man-beyond-the-spider-verse-trailer-leaks-online-1237040700/</w:t>
+        <w:t>https://www.abc.net.au/news/2026-08-16/how-much-might-it-cost-to-electrify-road-freight/106956614</w:t>
       </w:r>
     </w:p>
     <w:p>
@@ -7881,7 +6682,7 @@
         <w:pStyle w:val="ListBullet"/>
       </w:pPr>
       <w:r>
-        <w:t>https://www.tmz.com/2026/08/14/james-pearce-jr-suspended/</w:t>
+        <w:t>https://www.abc.net.au/news/2026-08-16/yuntas-newest-residents-take-over-the-local-pub-sa/107005296</w:t>
       </w:r>
     </w:p>
     <w:p>
@@ -7889,7 +6690,7 @@
         <w:pStyle w:val="ListBullet"/>
       </w:pPr>
       <w:r>
-        <w:t>https://www.cbsnews.com/news/how-to-get-a-tariff-refund-ieepa/</w:t>
+        <w:t>https://www.abc.net.au/news/2026-08-16/your-say-volunteers-adelaide-sing-out-choir-early-bird-cafe/107038984</w:t>
       </w:r>
     </w:p>
     <w:p>
@@ -7897,7 +6698,7 @@
         <w:pStyle w:val="ListBullet"/>
       </w:pPr>
       <w:r>
-        <w:t>https://www.abc.net.au/news/2026-08-15/sean-dorney-waiting-for-aged-care-support-at-home-four-corners/107010964</w:t>
+        <w:t>https://www.abc.net.au/news/2026-08-16/search-for-survivors-after-indonesia-earthquake/107042186</w:t>
       </w:r>
     </w:p>
     <w:p>
@@ -7905,7 +6706,7 @@
         <w:pStyle w:val="ListBullet"/>
       </w:pPr>
       <w:r>
-        <w:t>https://feeds.texastribune.org/link/16799/17418472/austin-isd-ratings-texas-school-takeover-trigger</w:t>
+        <w:t>https://www.cbsnews.com/news/democratic-national-committee-presidential-primary-south-carolina-vote/</w:t>
       </w:r>
     </w:p>
     <w:p>
@@ -7913,7 +6714,7 @@
         <w:pStyle w:val="ListBullet"/>
       </w:pPr>
       <w:r>
-        <w:t>https://www.nbcnews.com/world/united-kingdom/tinderbox-britain-bans-disposable-barbecues-nationwide-fire-alert-rcna592600</w:t>
+        <w:t>https://www.nbcnews.com/select/shopping/pattern-beauty-heat-collection-launch-rcna592362</w:t>
       </w:r>
     </w:p>
     <w:p>
@@ -7921,7 +6722,7 @@
         <w:pStyle w:val="ListBullet"/>
       </w:pPr>
       <w:r>
-        <w:t>https://www.nbcnews.com/news/us-news/alex-murdaugh-granted-change-venue-murder-retrial-rcna592594</w:t>
+        <w:t>https://www.theinformation.com/articles/nvidia-nears-deal-guarantee-100-billion-financing-massive-data-center</w:t>
       </w:r>
     </w:p>
     <w:p>
@@ -7929,7 +6730,7 @@
         <w:pStyle w:val="ListBullet"/>
       </w:pPr>
       <w:r>
-        <w:t>https://abcnews.com/Politics/sen-warren-demands-answers-rfk-jr-calamitous-response/story?id=135633761</w:t>
+        <w:t>https://fortune.com/2026/08/15/jane-street-loss-15-billion-situational-awareness-stake-ai-bets/</w:t>
       </w:r>
     </w:p>
     <w:p>
@@ -7937,7 +6738,7 @@
         <w:pStyle w:val="ListBullet"/>
       </w:pPr>
       <w:r>
-        <w:t>https://techcrunch.com/2026/08/14/read-it-later-app-pocket-is-shutting-down-here-are-the-best-alternatives/</w:t>
+        <w:t>https://www.theguardian.com/food/2026/aug/15/best-salad-recipes-lettuce-free-cyclospora</w:t>
       </w:r>
     </w:p>
     <w:p>
@@ -7945,7 +6746,7 @@
         <w:pStyle w:val="ListBullet"/>
       </w:pPr>
       <w:r>
-        <w:t>https://variety.com/2026/film/news/squishmallows-movie-amazon-mgm-beau-flynn-1236834782/</w:t>
+        <w:t>https://www.bbc.co.uk/news/articles/cwyjjvd4g0qo?at_medium=RSS&amp;at_campaign=rss</w:t>
       </w:r>
     </w:p>
     <w:p>
@@ -7953,7 +6754,7 @@
         <w:pStyle w:val="ListBullet"/>
       </w:pPr>
       <w:r>
-        <w:t>https://deadline.com/2026/08/deli-boys-canceled-hulu-1237040657/</w:t>
+        <w:t>https://www.tmz.com/2026/08/15/netflix-wants-tyra-banks-defamation-suit-dismissed/</w:t>
       </w:r>
     </w:p>
     <w:p>
@@ -7961,7 +6762,7 @@
         <w:pStyle w:val="ListBullet"/>
       </w:pPr>
       <w:r>
-        <w:t>https://deadline.com/2026/08/scrubs-keyla-monterroso-mejia-nurse-season-2-abc-reboot-1237040761/</w:t>
+        <w:t>https://fortune.com/2026/08/15/trump-aircraft-carrier-asia-iran-george-washington-abraham-lincoln-china-aggression/</w:t>
       </w:r>
     </w:p>
     <w:p>
@@ -7969,7 +6770,7 @@
         <w:pStyle w:val="ListBullet"/>
       </w:pPr>
       <w:r>
-        <w:t>https://pagesix.com/video/rhoc-recap-heather-attempts-to-break-up-gina-emily-friendship/</w:t>
+        <w:t>https://fortune.com/2026/08/15/anthropic-revenue-q2-11-5-billion-ipo-investors/</w:t>
       </w:r>
     </w:p>
     <w:p>
@@ -7977,7 +6778,7 @@
         <w:pStyle w:val="ListBullet"/>
       </w:pPr>
       <w:r>
-        <w:t>https://www.cbsnews.com/news/fbi-crime-data-violent-crime-murder-white-house/</w:t>
+        <w:t>https://abcnews.com/International/2-dead-after-powerful-77-earthquake-strikes-off/story?id=135664681</w:t>
       </w:r>
     </w:p>
     <w:p>
@@ -7985,7 +6786,7 @@
         <w:pStyle w:val="ListBullet"/>
       </w:pPr>
       <w:r>
-        <w:t>https://www.businessinsider.com/aaron-sorkin-optimistic-ai-filmmaking-social-reckoning-2026-8</w:t>
+        <w:t>https://www.cbsnews.com/news/phoenix-air-traffic-controller-2-american-airlines-flights-same-call-number-converge/</w:t>
       </w:r>
     </w:p>
     <w:p>
@@ -7993,7 +6794,7 @@
         <w:pStyle w:val="ListBullet"/>
       </w:pPr>
       <w:r>
-        <w:t>https://www.scmp.com/business/china-business/article/3364009/shein-eyes-valuation-rivalling-hm-will-market-buy-it?utm_source=rss_feed</w:t>
+        <w:t>https://thehill.com/homenews/administration/6031052-doj-refers-to-air-force-one-threat-as-assassination-attempt-in-ballroom-appeal/</w:t>
       </w:r>
     </w:p>
     <w:p>
@@ -8001,7 +6802,7 @@
         <w:pStyle w:val="ListBullet"/>
       </w:pPr>
       <w:r>
-        <w:t>https://abcnews.com/International/american-missionary-kevin-rideout-released-after-9-months/story?id=135644680</w:t>
+        <w:t>https://deadline.com/2026/08/2026-dorian-tv-awards-winners-list-heated-rivalry-hacks-1237033386/</w:t>
       </w:r>
     </w:p>
     <w:p>
@@ -8009,7 +6810,7 @@
         <w:pStyle w:val="ListBullet"/>
       </w:pPr>
       <w:r>
-        <w:t>https://www.tmz.com/2026/08/14/ny-jets-receiver-allen-lazard-former-miss-peru-camila-escribens-call-off-engagement/</w:t>
+        <w:t>https://www.latimes.com/california/story/2026-08-15/robert-carradine-family-lawsuit-suing-ucla-wrongful-death</w:t>
       </w:r>
     </w:p>
     <w:p>
@@ -8017,7 +6818,7 @@
         <w:pStyle w:val="ListBullet"/>
       </w:pPr>
       <w:r>
-        <w:t>https://abcnews.com/US/tropical-storm-lala-forecast-impact-hawaiian-islands-weekend/story?id=135610026</w:t>
+        <w:t>https://www.tmz.com/2026/08/15/bryan-kohberger-mental-health-evaluation/</w:t>
       </w:r>
     </w:p>
     <w:p>
@@ -8025,7 +6826,7 @@
         <w:pStyle w:val="ListBullet"/>
       </w:pPr>
       <w:r>
-        <w:t>https://www.theguardian.com/society/video/2026/aug/14/gen-z-and-millennials-have-it-far-worse-than-my-generation-opinion</w:t>
+        <w:t>https://www.cbc.ca/news/canada/british-columbia/wildfire-insurance-what-to-know-9.7305044?cmp=rss</w:t>
       </w:r>
     </w:p>
     <w:p>
@@ -8033,7 +6834,7 @@
         <w:pStyle w:val="ListBullet"/>
       </w:pPr>
       <w:r>
-        <w:t>https://www.axios.com/2026/08/14/andy-baker-national-security-needham-sims</w:t>
+        <w:t>https://fortune.com/2026/08/15/trump-political-strategy-in-charge-everything-responsible-nothing/</w:t>
       </w:r>
     </w:p>
     <w:p>
@@ -8041,7 +6842,7 @@
         <w:pStyle w:val="ListBullet"/>
       </w:pPr>
       <w:r>
-        <w:t>https://abcnews.com/Politics/us-intel-officials-assessed-threat-trump-credible-ahead/story?id=135631452</w:t>
+        <w:t>https://fortune.com/2026/08/15/nvidia-21-billion-spacex-stake-30-billion-intel-shares/</w:t>
       </w:r>
     </w:p>
     <w:p>
@@ -8049,7 +6850,7 @@
         <w:pStyle w:val="ListBullet"/>
       </w:pPr>
       <w:r>
-        <w:t>https://www.theguardian.com/politics/audio/2026/aug/14/donald-trump-great-plane-escape-podcast</w:t>
+        <w:t>https://fortune.com/2026/08/15/berkshire-hathaway-delta-alphabet-stakes-greg-abel-cash-pile-warren-buffett/</w:t>
       </w:r>
     </w:p>
     <w:p>
@@ -8057,7 +6858,7 @@
         <w:pStyle w:val="ListBullet"/>
       </w:pPr>
       <w:r>
-        <w:t>https://www.cbsnews.com/news/ryanair-bird-strike-passenger-window-ntsb/</w:t>
+        <w:t>https://thehill.com/homenews/administration/6031322-trump-accuses-national-trust-revealing-info-ballroom/</w:t>
       </w:r>
     </w:p>
     <w:p>
@@ -8065,7 +6866,7 @@
         <w:pStyle w:val="ListBullet"/>
       </w:pPr>
       <w:r>
-        <w:t>https://www.tmz.com/2026/08/14/marcellus-wiley-estranged-wife-annemarie-seeks-financial-support-amid-divorce/</w:t>
+        <w:t>https://www.abc.net.au/news/2026-08-15/quick-hits-australia-vs-bangladesh-day-three-first-test/107037432</w:t>
       </w:r>
     </w:p>
     <w:p>
@@ -8073,7 +6874,7 @@
         <w:pStyle w:val="ListBullet"/>
       </w:pPr>
       <w:r>
-        <w:t>https://www.tmz.com/2026/08/14/mckenna-west-wrote-letter-explaining-why-she-did-not-want-abortion/</w:t>
+        <w:t>https://insideclimatenews.org/news/15082026/colorado-river-dam-expansion-climate-considerations/</w:t>
       </w:r>
     </w:p>
     <w:p>
@@ -8081,7 +6882,7 @@
         <w:pStyle w:val="ListBullet"/>
       </w:pPr>
       <w:r>
-        <w:t>https://www.cbsnews.com/news/world-war-ii-memorial-vandalism-charges-melissa-farris/</w:t>
+        <w:t>https://www.tmz.com/2026/08/14/mckenna-west-says-she-knows-a-healthy-child-with-baby-gabriel-heart-defect/</w:t>
       </w:r>
     </w:p>
     <w:p>
@@ -8089,7 +6890,7 @@
         <w:pStyle w:val="ListBullet"/>
       </w:pPr>
       <w:r>
-        <w:t>https://www.tmz.com/2026/08/13/surrogate-mckenna-west-vows-supreme-court-fight-over-baby/</w:t>
+        <w:t>https://www.businessinsider.com/lawsuit-alleges-sony-investigation-into-wpp-rebates-2026-8</w:t>
       </w:r>
     </w:p>
     <w:p>
@@ -8097,7 +6898,7 @@
         <w:pStyle w:val="ListBullet"/>
       </w:pPr>
       <w:r>
-        <w:t>https://www.tmz.com/2026/08/13/taylor-frankie-paul-ex-husband-tate-files-unseal-drug-test-results/</w:t>
+        <w:t>https://www.theguardian.com/us-news/video/2026/aug/14/era-of-joyless-decadence-stateside-podcast</w:t>
       </w:r>
     </w:p>
     <w:p>
@@ -8105,7 +6906,7 @@
         <w:pStyle w:val="ListBullet"/>
       </w:pPr>
       <w:r>
-        <w:t>https://abcnews.com/Politics/democrats-demand-answers-conditions-aboard-uss-lincoln/story?id=135616596</w:t>
+        <w:t>https://www.scmp.com/news/china/diplomacy/article/3364025/china-rattled-trump-white-house-chaos-weeks-ahead-xi-visit-it-has-happened?utm_source=rss_feed</w:t>
       </w:r>
     </w:p>
     <w:p>
@@ -8113,7 +6914,7 @@
         <w:pStyle w:val="ListBullet"/>
       </w:pPr>
       <w:r>
-        <w:t>https://www.bloomberg.com/news/articles/2026-08-14/us-military-option-for-cuba-fades-as-trump-focuses-on-sanctions</w:t>
+        <w:t>https://abcnews.com/Politics/pirro-announces-arrest-wwii-memorial-vandalism/story?id=135642645</w:t>
       </w:r>
     </w:p>
     <w:p>
@@ -8121,7 +6922,7 @@
         <w:pStyle w:val="ListBullet"/>
       </w:pPr>
       <w:r>
-        <w:t>https://www.bloomberg.com/news/articles/2026-08-14/doj-cftc-investigating-iron-ore-trader-radiant-world-s-deals</w:t>
+        <w:t>https://www.semafor.com/article/08/14/2026/white-house-prepares-to-host-crypto-and-prediction-market-execs</w:t>
       </w:r>
     </w:p>
     <w:p>
@@ -8129,7 +6930,7 @@
         <w:pStyle w:val="ListBullet"/>
       </w:pPr>
       <w:r>
-        <w:t>https://www.sueddeutsche.de/politik/landwirtschaft-deutschland-folgen-trockenheit-forderungen-bauernverband-li.3531494</w:t>
+        <w:t>https://www.cnbc.com/2026/08/14/berkshire-hathaway-boosts-alphabet-to-a-top-three-holding-ups-delta-and-housing-bets.html</w:t>
       </w:r>
     </w:p>
     <w:p>
@@ -8137,7 +6938,7 @@
         <w:pStyle w:val="ListBullet"/>
       </w:pPr>
       <w:r>
-        <w:t>https://www.tmz.com/2026/08/13/kyrsten-sinema-asked-by-lawyers-about-having-sex-with-boyfriend/</w:t>
+        <w:t>https://www.theguardian.com/media/2026/aug/14/bbc-trump-children-subpoenas-lawsuit</w:t>
       </w:r>
     </w:p>
     <w:p>
@@ -8145,7 +6946,7 @@
         <w:pStyle w:val="ListBullet"/>
       </w:pPr>
       <w:r>
-        <w:t>https://www.scmp.com/news/world/united-states-canada/article/3363962/luigi-mangione-expected-plead-guilty-us-ceo-killing?utm_source=rss_feed</w:t>
+        <w:t>https://www.cbsnews.com/news/uss-abraham-lincoln-crew-deployment-concerns/</w:t>
       </w:r>
     </w:p>
     <w:p>
@@ -8153,7 +6954,7 @@
         <w:pStyle w:val="ListBullet"/>
       </w:pPr>
       <w:r>
-        <w:t>https://www.nature.com/articles/s41586-026-11023-3</w:t>
+        <w:t>https://www.latimes.com/entertainment-arts/business/story/2026-08-14/cbs-news-matt-gutman-accused-sexual-harassment-lawsuit</w:t>
       </w:r>
     </w:p>
     <w:p>
@@ -8161,7 +6962,7 @@
         <w:pStyle w:val="ListBullet"/>
       </w:pPr>
       <w:r>
-        <w:t>https://www.theinformation.com/articles/anthropics-first-lady-took-winding-road-top</w:t>
+        <w:t>https://www.bbc.co.uk/news/articles/c204de2jjxzo?at_medium=RSS&amp;at_campaign=rss</w:t>
       </w:r>
     </w:p>
     <w:p>
@@ -8169,7 +6970,7 @@
         <w:pStyle w:val="ListBullet"/>
       </w:pPr>
       <w:r>
-        <w:t>https://www.wired.com/story/mark-zuckerbergs-ai-manifesto-is-6500-words-and-barely-says-anything/</w:t>
+        <w:t>https://www.cbsnews.com/news/justice-department-opinion-military-migrants-trespassing/</w:t>
       </w:r>
     </w:p>
     <w:p>
@@ -8177,7 +6978,7 @@
         <w:pStyle w:val="ListBullet"/>
       </w:pPr>
       <w:r>
-        <w:t>https://www.axios.com/2026/08/13/midterms-senate-health-care-republicans-trump</w:t>
+        <w:t>https://deadline.com/2026/08/paramount-wbd-merger-david-ellison-costs-complaints-1237040803/</w:t>
       </w:r>
     </w:p>
     <w:p>
@@ -8185,7 +6986,7 @@
         <w:pStyle w:val="ListBullet"/>
       </w:pPr>
       <w:r>
-        <w:t>https://www.abc.net.au/news/2026-08-14/asx-markets-business-live-news-august-14-2026/107036290</w:t>
+        <w:t>https://www.tmz.com/2026/08/14/dorit-kemsley-stops-pk-from-forcing-sale-of-their-marital-home/</w:t>
       </w:r>
     </w:p>
     <w:p>
@@ -8193,7 +6994,7 @@
         <w:pStyle w:val="ListBullet"/>
       </w:pPr>
       <w:r>
-        <w:t>https://www.tmz.com/2026/08/13/alex-cooper-unwell-beverages-closing/</w:t>
+        <w:t>https://www.tmz.com/2026/08/14/jax-taylor-and-lori-krebs-seen-on-dinner-date/</w:t>
       </w:r>
     </w:p>
     <w:p>
@@ -8201,7 +7002,7 @@
         <w:pStyle w:val="ListBullet"/>
       </w:pPr>
       <w:r>
-        <w:t>https://www.tmz.com/2026/08/13/steven-tyler-fighting-accuser-over-abortion-evidence-in-court-battle/</w:t>
+        <w:t>https://www.tmz.com/2026/08/14/perez-hilton-treated-for-overdose-after-disturbing-live-stream/</w:t>
       </w:r>
     </w:p>
     <w:p>
@@ -8209,7 +7010,7 @@
         <w:pStyle w:val="ListBullet"/>
       </w:pPr>
       <w:r>
-        <w:t>https://www.latimes.com/world-nation/story/2026-08-13/judge-dismisses-trump-lawsuit-alleging-antisemitism-at-harvard</w:t>
+        <w:t>https://www.abc.net.au/news/2026-08-15/clacton-by-election-weirdest-in-recent-uk-history/107040534</w:t>
       </w:r>
     </w:p>
     <w:p>
@@ -8217,7 +7018,7 @@
         <w:pStyle w:val="ListBullet"/>
       </w:pPr>
       <w:r>
-        <w:t>https://www.aljazeera.com/news/liveblog/2026/8/14/iran-war-live-us-eyes-indefinite-iran-naval-blockade?traffic_source=rss</w:t>
+        <w:t>https://www.tmz.com/2026/08/14/renee-zellweger-works-with-pottery-at-art-festival/</w:t>
       </w:r>
     </w:p>
     <w:p>
@@ -8225,7 +7026,7 @@
         <w:pStyle w:val="ListBullet"/>
       </w:pPr>
       <w:r>
-        <w:t>https://www.bbc.co.uk/news/articles/cz972d30l30o?at_medium=RSS&amp;at_campaign=rss</w:t>
+        <w:t>https://www.abc.net.au/news/2026-08-15/alice-springs-kumanjayi-little-baby-funeral/107029704</w:t>
       </w:r>
     </w:p>
     <w:p>
@@ -8233,63 +7034,7 @@
         <w:pStyle w:val="ListBullet"/>
       </w:pPr>
       <w:r>
-        <w:t>https://thehill.com/regulation/court-battles/6028655-alien-enemies-act-challenge-moot-trump-deportations/</w:t>
-      </w:r>
-    </w:p>
-    <w:p>
-      <w:pPr>
-        <w:pStyle w:val="ListBullet"/>
-      </w:pPr>
-      <w:r>
-        <w:t>https://www.tmz.com/2026/08/13/alleged-tupac-shakur-killer-isnt-nervous-to-go-to-prison/</w:t>
-      </w:r>
-    </w:p>
-    <w:p>
-      <w:pPr>
-        <w:pStyle w:val="ListBullet"/>
-      </w:pPr>
-      <w:r>
-        <w:t>https://www.cbc.ca/news/politics/canada-u-s-trade-talks-booze-bans-9.7307849?cmp=rss</w:t>
-      </w:r>
-    </w:p>
-    <w:p>
-      <w:pPr>
-        <w:pStyle w:val="ListBullet"/>
-      </w:pPr>
-      <w:r>
-        <w:t>https://www.nbcnews.com/select/shopping/brick-phone-app-blocker-review-rcna259740</w:t>
-      </w:r>
-    </w:p>
-    <w:p>
-      <w:pPr>
-        <w:pStyle w:val="ListBullet"/>
-      </w:pPr>
-      <w:r>
-        <w:t>https://deadline.com/2026/08/paramount-merger-teamsters-protest-1237033400/</w:t>
-      </w:r>
-    </w:p>
-    <w:p>
-      <w:pPr>
-        <w:pStyle w:val="ListBullet"/>
-      </w:pPr>
-      <w:r>
-        <w:t>https://pagesix.com/2026/08/13/celebrity-news/perez-hiltons-sister-gives-update-on-celeb-bloggers-injuries-details-his-long-road-of-recovery/</w:t>
-      </w:r>
-    </w:p>
-    <w:p>
-      <w:pPr>
-        <w:pStyle w:val="ListBullet"/>
-      </w:pPr>
-      <w:r>
-        <w:t>https://www.tmz.com/2026/08/13/malcolm-jamal-warner-mother-settles-with-his-daughters-guardians/</w:t>
-      </w:r>
-    </w:p>
-    <w:p>
-      <w:pPr>
-        <w:pStyle w:val="ListBullet"/>
-      </w:pPr>
-      <w:r>
-        <w:t>https://www.tmz.com/2026/08/13/lindsay-clancy-toxicology-report-from-day-of-alleged-murders/</w:t>
+        <w:t>https://www.abc.net.au/news/2026-08-15/endangered-blue-tailed-skinks-released-on-horsburgh-island/107032122</w:t>
       </w:r>
     </w:p>
     <w:sectPr>

</xml_diff>